<commit_message>
docs: simplify assessment docs and add setup screenshots to brief
Reduce bold emphasis, remove horizontal separators, drop the Issues-tab and Firebase-hosting notes, shorten the Discord reference, and remove the Feedback issue paragraph and Sign-offs Tracker section from the README. Sync the coursework brief with the southsea_cinema README, add the step-by-step setup screenshots so images render, and rebuild the brief docx.
</commit_message>
<xml_diff>
--- a/southsea_cinema_coursework_brief.docx
+++ b/southsea_cinema_coursework_brief.docx
@@ -2,7 +2,7 @@
 <file path=word/document.xml><?xml version="1.0" encoding="utf-8"?>
 <w:document xmlns:w="http://schemas.openxmlformats.org/wordprocessingml/2006/main" xmlns:m="http://schemas.openxmlformats.org/officeDocument/2006/math" xmlns:r="http://schemas.openxmlformats.org/officeDocument/2006/relationships" xmlns:o="urn:schemas-microsoft-com:office:office" xmlns:v="urn:schemas-microsoft-com:vml" xmlns:w10="urn:schemas-microsoft-com:office:word" xmlns:a="http://schemas.openxmlformats.org/drawingml/2006/main" xmlns:pic="http://schemas.openxmlformats.org/drawingml/2006/picture" xmlns:wp="http://schemas.openxmlformats.org/drawingml/2006/wordprocessingDrawing">
   <w:body>
-    <w:bookmarkStart w:id="48" w:name="southsea-cinema-flutter-coursework"/>
+    <w:bookmarkStart w:id="72" w:name="southsea-cinema-flutter-coursework"/>
     <w:p>
       <w:pPr>
         <w:pStyle w:val="Heading1"/>
@@ -462,7 +462,7 @@
       </w:r>
     </w:p>
     <w:bookmarkEnd w:id="22"/>
-    <w:bookmarkStart w:id="31" w:name="getting-started"/>
+    <w:bookmarkStart w:id="58" w:name="getting-started"/>
     <w:p>
       <w:pPr>
         <w:pStyle w:val="Heading2"/>
@@ -597,7 +597,7 @@
       </w:r>
     </w:p>
     <w:bookmarkEnd w:id="25"/>
-    <w:bookmarkStart w:id="27" w:name="fork-the-repository"/>
+    <w:bookmarkStart w:id="33" w:name="fork-the-repository"/>
     <w:p>
       <w:pPr>
         <w:pStyle w:val="Heading3"/>
@@ -658,7 +658,82 @@
         </w:r>
       </w:hyperlink>
       <w:r>
-        <w:t xml:space="preserve">). Leave the default options as they are and click</w:t>
+        <w:t xml:space="preserve">):</w:t>
+      </w:r>
+    </w:p>
+    <w:p>
+      <w:pPr>
+        <w:pStyle w:val="CaptionedFigure"/>
+      </w:pPr>
+      <w:r>
+        <w:drawing>
+          <wp:inline>
+            <wp:extent cx="5334000" cy="2097575"/>
+            <wp:effectExtent b="0" l="0" r="0" t="0"/>
+            <wp:docPr descr="Clicking the Fork button on GitHub" title="" id="28" name="Picture"/>
+            <a:graphic>
+              <a:graphicData uri="http://schemas.openxmlformats.org/drawingml/2006/picture">
+                <pic:pic>
+                  <pic:nvPicPr>
+                    <pic:cNvPr descr="images/step1_fork_button.png" id="29" name="Picture"/>
+                    <pic:cNvPicPr>
+                      <a:picLocks noChangeArrowheads="1" noChangeAspect="1"/>
+                    </pic:cNvPicPr>
+                  </pic:nvPicPr>
+                  <pic:blipFill>
+                    <a:blip r:embed="rId27"/>
+                    <a:stretch>
+                      <a:fillRect/>
+                    </a:stretch>
+                  </pic:blipFill>
+                  <pic:spPr bwMode="auto">
+                    <a:xfrm>
+                      <a:off x="0" y="0"/>
+                      <a:ext cx="5334000" cy="2097575"/>
+                    </a:xfrm>
+                    <a:prstGeom prst="rect">
+                      <a:avLst/>
+                    </a:prstGeom>
+                    <a:noFill/>
+                    <a:ln w="9525">
+                      <a:noFill/>
+                      <a:headEnd/>
+                      <a:tailEnd/>
+                    </a:ln>
+                  </pic:spPr>
+                </pic:pic>
+              </a:graphicData>
+            </a:graphic>
+          </wp:inline>
+        </w:drawing>
+      </w:r>
+    </w:p>
+    <w:p>
+      <w:pPr>
+        <w:pStyle w:val="ImageCaption"/>
+      </w:pPr>
+      <w:r>
+        <w:t xml:space="preserve">Clicking the Fork button on GitHub</w:t>
+      </w:r>
+    </w:p>
+    <w:p>
+      <w:pPr>
+        <w:pStyle w:val="BodyText"/>
+      </w:pPr>
+      <w:r>
+        <w:t xml:space="preserve">On the</w:t>
+      </w:r>
+      <w:r>
+        <w:t xml:space="preserve"> </w:t>
+      </w:r>
+      <w:r>
+        <w:t xml:space="preserve">“Create a new fork”</w:t>
+      </w:r>
+      <w:r>
+        <w:t xml:space="preserve"> </w:t>
+      </w:r>
+      <w:r>
+        <w:t xml:space="preserve">page, leave the default options as they are (do not change the repository name) and click</w:t>
       </w:r>
       <w:r>
         <w:t xml:space="preserve"> </w:t>
@@ -671,7 +746,70 @@
         <w:t xml:space="preserve">Create fork</w:t>
       </w:r>
       <w:r>
-        <w:t xml:space="preserve">. Your fork must be named</w:t>
+        <w:t xml:space="preserve">:</w:t>
+      </w:r>
+    </w:p>
+    <w:p>
+      <w:pPr>
+        <w:pStyle w:val="CaptionedFigure"/>
+      </w:pPr>
+      <w:r>
+        <w:drawing>
+          <wp:inline>
+            <wp:extent cx="5334000" cy="3968261"/>
+            <wp:effectExtent b="0" l="0" r="0" t="0"/>
+            <wp:docPr descr="Creating a new fork on GitHub" title="" id="31" name="Picture"/>
+            <a:graphic>
+              <a:graphicData uri="http://schemas.openxmlformats.org/drawingml/2006/picture">
+                <pic:pic>
+                  <pic:nvPicPr>
+                    <pic:cNvPr descr="images/step1_create_fork.png" id="32" name="Picture"/>
+                    <pic:cNvPicPr>
+                      <a:picLocks noChangeArrowheads="1" noChangeAspect="1"/>
+                    </pic:cNvPicPr>
+                  </pic:nvPicPr>
+                  <pic:blipFill>
+                    <a:blip r:embed="rId30"/>
+                    <a:stretch>
+                      <a:fillRect/>
+                    </a:stretch>
+                  </pic:blipFill>
+                  <pic:spPr bwMode="auto">
+                    <a:xfrm>
+                      <a:off x="0" y="0"/>
+                      <a:ext cx="5334000" cy="3968261"/>
+                    </a:xfrm>
+                    <a:prstGeom prst="rect">
+                      <a:avLst/>
+                    </a:prstGeom>
+                    <a:noFill/>
+                    <a:ln w="9525">
+                      <a:noFill/>
+                      <a:headEnd/>
+                      <a:tailEnd/>
+                    </a:ln>
+                  </pic:spPr>
+                </pic:pic>
+              </a:graphicData>
+            </a:graphic>
+          </wp:inline>
+        </w:drawing>
+      </w:r>
+    </w:p>
+    <w:p>
+      <w:pPr>
+        <w:pStyle w:val="ImageCaption"/>
+      </w:pPr>
+      <w:r>
+        <w:t xml:space="preserve">Creating a new fork on GitHub</w:t>
+      </w:r>
+    </w:p>
+    <w:p>
+      <w:pPr>
+        <w:pStyle w:val="BodyText"/>
+      </w:pPr>
+      <w:r>
+        <w:t xml:space="preserve">Your fork must be named</w:t>
       </w:r>
       <w:r>
         <w:t xml:space="preserve"> </w:t>
@@ -683,15 +821,10 @@
         <w:t xml:space="preserve">southsea_cinema</w:t>
       </w:r>
       <w:r>
-        <w:t xml:space="preserve">; if you already have a repository with this name, rename it beforehand.</w:t>
-      </w:r>
-    </w:p>
-    <w:p>
-      <w:pPr>
-        <w:pStyle w:val="BodyText"/>
-      </w:pPr>
-      <w:r>
-        <w:t xml:space="preserve">You should then have a public fork with a URL like:</w:t>
+        <w:t xml:space="preserve"> </w:t>
+      </w:r>
+      <w:r>
+        <w:t xml:space="preserve">(if you already have a repository with this name, rename it beforehand) and should have a URL like:</w:t>
       </w:r>
     </w:p>
     <w:p>
@@ -705,8 +838,8 @@
         <w:t xml:space="preserve">https://github.com/YOUR-USERNAME/southsea_cinema</w:t>
       </w:r>
     </w:p>
-    <w:bookmarkEnd w:id="27"/>
-    <w:bookmarkStart w:id="28" w:name="clone-your-forked-repository"/>
+    <w:bookmarkEnd w:id="33"/>
+    <w:bookmarkStart w:id="40" w:name="clone-your-forked-repository"/>
     <w:p>
       <w:pPr>
         <w:pStyle w:val="Heading3"/>
@@ -720,189 +853,7 @@
         <w:pStyle w:val="FirstParagraph"/>
       </w:pPr>
       <w:r>
-        <w:t xml:space="preserve">Open a terminal, change to your desired directory, and run:</w:t>
-      </w:r>
-    </w:p>
-    <w:p>
-      <w:pPr>
-        <w:pStyle w:val="SourceCode"/>
-      </w:pPr>
-      <w:r>
-        <w:rPr>
-          <w:rStyle w:val="FunctionTok"/>
-        </w:rPr>
-        <w:t xml:space="preserve">git</w:t>
-      </w:r>
-      <w:r>
-        <w:rPr>
-          <w:rStyle w:val="NormalTok"/>
-        </w:rPr>
-        <w:t xml:space="preserve"> clone https://github.com/YOUR-USERNAME/southsea_cinema.git</w:t>
-      </w:r>
-      <w:r>
-        <w:br/>
-      </w:r>
-      <w:r>
-        <w:rPr>
-          <w:rStyle w:val="BuiltInTok"/>
-        </w:rPr>
-        <w:t xml:space="preserve">cd</w:t>
-      </w:r>
-      <w:r>
-        <w:rPr>
-          <w:rStyle w:val="NormalTok"/>
-        </w:rPr>
-        <w:t xml:space="preserve"> southsea_cinema</w:t>
-      </w:r>
-    </w:p>
-    <w:p>
-      <w:pPr>
-        <w:pStyle w:val="FirstParagraph"/>
-      </w:pPr>
-      <w:r>
-        <w:t xml:space="preserve">Replace</w:t>
-      </w:r>
-      <w:r>
-        <w:t xml:space="preserve"> </w:t>
-      </w:r>
-      <w:r>
-        <w:rPr>
-          <w:rStyle w:val="VerbatimChar"/>
-        </w:rPr>
-        <w:t xml:space="preserve">YOUR-USERNAME</w:t>
-      </w:r>
-      <w:r>
-        <w:t xml:space="preserve"> </w:t>
-      </w:r>
-      <w:r>
-        <w:t xml:space="preserve">with your GitHub username.</w:t>
-      </w:r>
-    </w:p>
-    <w:bookmarkEnd w:id="28"/>
-    <w:bookmarkStart w:id="29" w:name="install-dependencies"/>
-    <w:p>
-      <w:pPr>
-        <w:pStyle w:val="Heading3"/>
-      </w:pPr>
-      <w:r>
-        <w:t xml:space="preserve">Install Dependencies</w:t>
-      </w:r>
-    </w:p>
-    <w:p>
-      <w:pPr>
-        <w:pStyle w:val="FirstParagraph"/>
-      </w:pPr>
-      <w:r>
-        <w:t xml:space="preserve">Your editor should automatically prompt you to install the required dependencies when you open the project. If not, open a terminal and run:</w:t>
-      </w:r>
-    </w:p>
-    <w:p>
-      <w:pPr>
-        <w:pStyle w:val="SourceCode"/>
-      </w:pPr>
-      <w:r>
-        <w:rPr>
-          <w:rStyle w:val="ExtensionTok"/>
-        </w:rPr>
-        <w:t xml:space="preserve">flutter</w:t>
-      </w:r>
-      <w:r>
-        <w:rPr>
-          <w:rStyle w:val="NormalTok"/>
-        </w:rPr>
-        <w:t xml:space="preserve"> pub get</w:t>
-      </w:r>
-    </w:p>
-    <w:bookmarkEnd w:id="29"/>
-    <w:bookmarkStart w:id="30" w:name="run-the-application"/>
-    <w:p>
-      <w:pPr>
-        <w:pStyle w:val="Heading3"/>
-      </w:pPr>
-      <w:r>
-        <w:t xml:space="preserve">Run the Application</w:t>
-      </w:r>
-    </w:p>
-    <w:p>
-      <w:pPr>
-        <w:pStyle w:val="FirstParagraph"/>
-      </w:pPr>
-      <w:r>
-        <w:t xml:space="preserve">This coursework targets Flutter Web and should be viewed in mobile view using your browser’s developer tools. We recommend Chrome or Edge.</w:t>
-      </w:r>
-    </w:p>
-    <w:p>
-      <w:pPr>
-        <w:pStyle w:val="SourceCode"/>
-      </w:pPr>
-      <w:r>
-        <w:rPr>
-          <w:rStyle w:val="ExtensionTok"/>
-        </w:rPr>
-        <w:t xml:space="preserve">flutter</w:t>
-      </w:r>
-      <w:r>
-        <w:rPr>
-          <w:rStyle w:val="NormalTok"/>
-        </w:rPr>
-        <w:t xml:space="preserve"> run </w:t>
-      </w:r>
-      <w:r>
-        <w:rPr>
-          <w:rStyle w:val="AttributeTok"/>
-        </w:rPr>
-        <w:t xml:space="preserve">-d</w:t>
-      </w:r>
-      <w:r>
-        <w:rPr>
-          <w:rStyle w:val="NormalTok"/>
-        </w:rPr>
-        <w:t xml:space="preserve"> chrome</w:t>
-      </w:r>
-    </w:p>
-    <w:p>
-      <w:pPr>
-        <w:pStyle w:val="FirstParagraph"/>
-      </w:pPr>
-      <w:r>
-        <w:t xml:space="preserve">or:</w:t>
-      </w:r>
-    </w:p>
-    <w:p>
-      <w:pPr>
-        <w:pStyle w:val="SourceCode"/>
-      </w:pPr>
-      <w:r>
-        <w:rPr>
-          <w:rStyle w:val="ExtensionTok"/>
-        </w:rPr>
-        <w:t xml:space="preserve">flutter</w:t>
-      </w:r>
-      <w:r>
-        <w:rPr>
-          <w:rStyle w:val="NormalTok"/>
-        </w:rPr>
-        <w:t xml:space="preserve"> run </w:t>
-      </w:r>
-      <w:r>
-        <w:rPr>
-          <w:rStyle w:val="AttributeTok"/>
-        </w:rPr>
-        <w:t xml:space="preserve">-d</w:t>
-      </w:r>
-      <w:r>
-        <w:rPr>
-          <w:rStyle w:val="NormalTok"/>
-        </w:rPr>
-        <w:t xml:space="preserve"> edge</w:t>
-      </w:r>
-    </w:p>
-    <w:p>
-      <w:pPr>
-        <w:pStyle w:val="FirstParagraph"/>
-      </w:pPr>
-      <w:r>
-        <w:t xml:space="preserve">Once the app is running, open developer tools (right-click the page and choose</w:t>
+        <w:t xml:space="preserve">On your forked repository page, click the green</w:t>
       </w:r>
       <w:r>
         <w:t xml:space="preserve"> </w:t>
@@ -912,10 +863,76 @@
           <w:b/>
           <w:bCs/>
         </w:rPr>
-        <w:t xml:space="preserve">Inspect</w:t>
-      </w:r>
-      <w:r>
-        <w:t xml:space="preserve">, or press F12), click the</w:t>
+        <w:t xml:space="preserve">Code</w:t>
+      </w:r>
+      <w:r>
+        <w:t xml:space="preserve"> </w:t>
+      </w:r>
+      <w:r>
+        <w:t xml:space="preserve">button and copy the HTTPS URL:</w:t>
+      </w:r>
+    </w:p>
+    <w:p>
+      <w:pPr>
+        <w:pStyle w:val="CaptionedFigure"/>
+      </w:pPr>
+      <w:r>
+        <w:drawing>
+          <wp:inline>
+            <wp:extent cx="5334000" cy="3945490"/>
+            <wp:effectExtent b="0" l="0" r="0" t="0"/>
+            <wp:docPr descr="Copying the clone URL from GitHub" title="" id="35" name="Picture"/>
+            <a:graphic>
+              <a:graphicData uri="http://schemas.openxmlformats.org/drawingml/2006/picture">
+                <pic:pic>
+                  <pic:nvPicPr>
+                    <pic:cNvPr descr="images/step2_clone_repository.png" id="36" name="Picture"/>
+                    <pic:cNvPicPr>
+                      <a:picLocks noChangeArrowheads="1" noChangeAspect="1"/>
+                    </pic:cNvPicPr>
+                  </pic:nvPicPr>
+                  <pic:blipFill>
+                    <a:blip r:embed="rId34"/>
+                    <a:stretch>
+                      <a:fillRect/>
+                    </a:stretch>
+                  </pic:blipFill>
+                  <pic:spPr bwMode="auto">
+                    <a:xfrm>
+                      <a:off x="0" y="0"/>
+                      <a:ext cx="5334000" cy="3945490"/>
+                    </a:xfrm>
+                    <a:prstGeom prst="rect">
+                      <a:avLst/>
+                    </a:prstGeom>
+                    <a:noFill/>
+                    <a:ln w="9525">
+                      <a:noFill/>
+                      <a:headEnd/>
+                      <a:tailEnd/>
+                    </a:ln>
+                  </pic:spPr>
+                </pic:pic>
+              </a:graphicData>
+            </a:graphic>
+          </wp:inline>
+        </w:drawing>
+      </w:r>
+    </w:p>
+    <w:p>
+      <w:pPr>
+        <w:pStyle w:val="ImageCaption"/>
+      </w:pPr>
+      <w:r>
+        <w:t xml:space="preserve">Copying the clone URL from GitHub</w:t>
+      </w:r>
+    </w:p>
+    <w:p>
+      <w:pPr>
+        <w:pStyle w:val="BodyText"/>
+      </w:pPr>
+      <w:r>
+        <w:t xml:space="preserve">If you are using VS Code, open the Source Control panel and click</w:t>
       </w:r>
       <w:r>
         <w:t xml:space="preserve"> </w:t>
@@ -925,24 +942,147 @@
           <w:b/>
           <w:bCs/>
         </w:rPr>
-        <w:t xml:space="preserve">Toggle device toolbar</w:t>
-      </w:r>
-      <w:r>
-        <w:t xml:space="preserve"> </w:t>
-      </w:r>
-      <w:r>
-        <w:t xml:space="preserve">button, and choose a phone-sized device preset from the dropdown menu.</w:t>
-      </w:r>
-    </w:p>
-    <w:bookmarkEnd w:id="30"/>
-    <w:bookmarkEnd w:id="31"/>
-    <w:bookmarkStart w:id="34" w:name="assessment-structure"/>
-    <w:p>
-      <w:pPr>
-        <w:pStyle w:val="Heading2"/>
-      </w:pPr>
-      <w:r>
-        <w:t xml:space="preserve">Assessment Structure</w:t>
+        <w:t xml:space="preserve">Clone Repository</w:t>
+      </w:r>
+      <w:r>
+        <w:t xml:space="preserve"> </w:t>
+      </w:r>
+      <w:r>
+        <w:t xml:space="preserve">(or open the Command Palette with</w:t>
+      </w:r>
+      <w:r>
+        <w:t xml:space="preserve"> </w:t>
+      </w:r>
+      <w:r>
+        <w:rPr>
+          <w:rStyle w:val="VerbatimChar"/>
+        </w:rPr>
+        <w:t xml:space="preserve">Ctrl+Shift+P</w:t>
+      </w:r>
+      <w:r>
+        <w:t xml:space="preserve"> </w:t>
+      </w:r>
+      <w:r>
+        <w:t xml:space="preserve">/</w:t>
+      </w:r>
+      <w:r>
+        <w:t xml:space="preserve"> </w:t>
+      </w:r>
+      <w:r>
+        <w:rPr>
+          <w:rStyle w:val="VerbatimChar"/>
+        </w:rPr>
+        <w:t xml:space="preserve">Cmd+Shift+P</w:t>
+      </w:r>
+      <w:r>
+        <w:t xml:space="preserve"> </w:t>
+      </w:r>
+      <w:r>
+        <w:t xml:space="preserve">and choose</w:t>
+      </w:r>
+      <w:r>
+        <w:t xml:space="preserve"> </w:t>
+      </w:r>
+      <w:r>
+        <w:t xml:space="preserve">“Git: Clone”</w:t>
+      </w:r>
+      <w:r>
+        <w:t xml:space="preserve">), then paste the URL you copied:</w:t>
+      </w:r>
+    </w:p>
+    <w:p>
+      <w:pPr>
+        <w:pStyle w:val="CaptionedFigure"/>
+      </w:pPr>
+      <w:r>
+        <w:drawing>
+          <wp:inline>
+            <wp:extent cx="5334000" cy="2587726"/>
+            <wp:effectExtent b="0" l="0" r="0" t="0"/>
+            <wp:docPr descr="Cloning the repository from VS Code" title="" id="38" name="Picture"/>
+            <a:graphic>
+              <a:graphicData uri="http://schemas.openxmlformats.org/drawingml/2006/picture">
+                <pic:pic>
+                  <pic:nvPicPr>
+                    <pic:cNvPr descr="images/step2_open_in_vscode.png" id="39" name="Picture"/>
+                    <pic:cNvPicPr>
+                      <a:picLocks noChangeArrowheads="1" noChangeAspect="1"/>
+                    </pic:cNvPicPr>
+                  </pic:nvPicPr>
+                  <pic:blipFill>
+                    <a:blip r:embed="rId37"/>
+                    <a:stretch>
+                      <a:fillRect/>
+                    </a:stretch>
+                  </pic:blipFill>
+                  <pic:spPr bwMode="auto">
+                    <a:xfrm>
+                      <a:off x="0" y="0"/>
+                      <a:ext cx="5334000" cy="2587726"/>
+                    </a:xfrm>
+                    <a:prstGeom prst="rect">
+                      <a:avLst/>
+                    </a:prstGeom>
+                    <a:noFill/>
+                    <a:ln w="9525">
+                      <a:noFill/>
+                      <a:headEnd/>
+                      <a:tailEnd/>
+                    </a:ln>
+                  </pic:spPr>
+                </pic:pic>
+              </a:graphicData>
+            </a:graphic>
+          </wp:inline>
+        </w:drawing>
+      </w:r>
+    </w:p>
+    <w:p>
+      <w:pPr>
+        <w:pStyle w:val="ImageCaption"/>
+      </w:pPr>
+      <w:r>
+        <w:t xml:space="preserve">Cloning the repository from VS Code</w:t>
+      </w:r>
+    </w:p>
+    <w:p>
+      <w:pPr>
+        <w:pStyle w:val="BodyText"/>
+      </w:pPr>
+      <w:r>
+        <w:t xml:space="preserve">Alternatively, if you are using a terminal, run:</w:t>
+      </w:r>
+    </w:p>
+    <w:p>
+      <w:pPr>
+        <w:pStyle w:val="SourceCode"/>
+      </w:pPr>
+      <w:r>
+        <w:rPr>
+          <w:rStyle w:val="FunctionTok"/>
+        </w:rPr>
+        <w:t xml:space="preserve">git</w:t>
+      </w:r>
+      <w:r>
+        <w:rPr>
+          <w:rStyle w:val="NormalTok"/>
+        </w:rPr>
+        <w:t xml:space="preserve"> clone https://github.com/YOUR-USERNAME/southsea_cinema.git</w:t>
+      </w:r>
+      <w:r>
+        <w:br/>
+      </w:r>
+      <w:r>
+        <w:rPr>
+          <w:rStyle w:val="BuiltInTok"/>
+        </w:rPr>
+        <w:t xml:space="preserve">cd</w:t>
+      </w:r>
+      <w:r>
+        <w:rPr>
+          <w:rStyle w:val="NormalTok"/>
+        </w:rPr>
+        <w:t xml:space="preserve"> southsea_cinema</w:t>
       </w:r>
     </w:p>
     <w:p>
@@ -950,7 +1090,40 @@
         <w:pStyle w:val="FirstParagraph"/>
       </w:pPr>
       <w:r>
-        <w:t xml:space="preserve">Your module (PAPL — M30235, or UXDI — M32605, depending on your cohort) has two assessments. This Southsea Cinema coursework is</w:t>
+        <w:t xml:space="preserve">Replace</w:t>
+      </w:r>
+      <w:r>
+        <w:t xml:space="preserve"> </w:t>
+      </w:r>
+      <w:r>
+        <w:rPr>
+          <w:rStyle w:val="VerbatimChar"/>
+        </w:rPr>
+        <w:t xml:space="preserve">YOUR-USERNAME</w:t>
+      </w:r>
+      <w:r>
+        <w:t xml:space="preserve"> </w:t>
+      </w:r>
+      <w:r>
+        <w:t xml:space="preserve">with your GitHub username.</w:t>
+      </w:r>
+    </w:p>
+    <w:bookmarkEnd w:id="40"/>
+    <w:bookmarkStart w:id="47" w:name="install-dependencies"/>
+    <w:p>
+      <w:pPr>
+        <w:pStyle w:val="Heading3"/>
+      </w:pPr>
+      <w:r>
+        <w:t xml:space="preserve">Install Dependencies</w:t>
+      </w:r>
+    </w:p>
+    <w:p>
+      <w:pPr>
+        <w:pStyle w:val="FirstParagraph"/>
+      </w:pPr>
+      <w:r>
+        <w:t xml:space="preserve">When you open the project, VS Code may show a popup asking if you want to fetch missing packages. If you see it, click</w:t>
       </w:r>
       <w:r>
         <w:t xml:space="preserve"> </w:t>
@@ -960,25 +1133,13 @@
           <w:b/>
           <w:bCs/>
         </w:rPr>
-        <w:t xml:space="preserve">Item 1</w:t>
-      </w:r>
-      <w:r>
-        <w:t xml:space="preserve">, worth</w:t>
-      </w:r>
-      <w:r>
-        <w:t xml:space="preserve"> </w:t>
+        <w:t xml:space="preserve">Run</w:t>
       </w:r>
       <w:r>
         <w:rPr>
           <w:b/>
           <w:bCs/>
         </w:rPr>
-        <w:t xml:space="preserve">50% of the overall module mark</w:t>
-      </w:r>
-      <w:r>
-        <w:t xml:space="preserve">. Item 1 is assessed as a</w:t>
-      </w:r>
-      <w:r>
         <w:t xml:space="preserve"> </w:t>
       </w:r>
       <w:r>
@@ -986,10 +1147,300 @@
           <w:b/>
           <w:bCs/>
         </w:rPr>
-        <w:t xml:space="preserve">portfolio of live demos</w:t>
-      </w:r>
-      <w:r>
-        <w:t xml:space="preserve">, not as a single submission: you build the app in</w:t>
+        <w:t xml:space="preserve">‘pub get’</w:t>
+      </w:r>
+      <w:r>
+        <w:t xml:space="preserve">:</w:t>
+      </w:r>
+    </w:p>
+    <w:p>
+      <w:pPr>
+        <w:pStyle w:val="CaptionedFigure"/>
+      </w:pPr>
+      <w:r>
+        <w:drawing>
+          <wp:inline>
+            <wp:extent cx="5334000" cy="3330479"/>
+            <wp:effectExtent b="0" l="0" r="0" t="0"/>
+            <wp:docPr descr="VS Code prompting to run pub get" title="" id="42" name="Picture"/>
+            <a:graphic>
+              <a:graphicData uri="http://schemas.openxmlformats.org/drawingml/2006/picture">
+                <pic:pic>
+                  <pic:nvPicPr>
+                    <pic:cNvPr descr="images/step3_flutter_pub_get_better.png" id="43" name="Picture"/>
+                    <pic:cNvPicPr>
+                      <a:picLocks noChangeArrowheads="1" noChangeAspect="1"/>
+                    </pic:cNvPicPr>
+                  </pic:nvPicPr>
+                  <pic:blipFill>
+                    <a:blip r:embed="rId41"/>
+                    <a:stretch>
+                      <a:fillRect/>
+                    </a:stretch>
+                  </pic:blipFill>
+                  <pic:spPr bwMode="auto">
+                    <a:xfrm>
+                      <a:off x="0" y="0"/>
+                      <a:ext cx="5334000" cy="3330479"/>
+                    </a:xfrm>
+                    <a:prstGeom prst="rect">
+                      <a:avLst/>
+                    </a:prstGeom>
+                    <a:noFill/>
+                    <a:ln w="9525">
+                      <a:noFill/>
+                      <a:headEnd/>
+                      <a:tailEnd/>
+                    </a:ln>
+                  </pic:spPr>
+                </pic:pic>
+              </a:graphicData>
+            </a:graphic>
+          </wp:inline>
+        </w:drawing>
+      </w:r>
+    </w:p>
+    <w:p>
+      <w:pPr>
+        <w:pStyle w:val="ImageCaption"/>
+      </w:pPr>
+      <w:r>
+        <w:t xml:space="preserve">VS Code prompting to run pub get</w:t>
+      </w:r>
+    </w:p>
+    <w:p>
+      <w:pPr>
+        <w:pStyle w:val="BodyText"/>
+      </w:pPr>
+      <w:r>
+        <w:t xml:space="preserve">If you do not see this popup, open a terminal and run the command manually:</w:t>
+      </w:r>
+    </w:p>
+    <w:p>
+      <w:pPr>
+        <w:pStyle w:val="SourceCode"/>
+      </w:pPr>
+      <w:r>
+        <w:rPr>
+          <w:rStyle w:val="ExtensionTok"/>
+        </w:rPr>
+        <w:t xml:space="preserve">flutter</w:t>
+      </w:r>
+      <w:r>
+        <w:rPr>
+          <w:rStyle w:val="NormalTok"/>
+        </w:rPr>
+        <w:t xml:space="preserve"> pub get</w:t>
+      </w:r>
+    </w:p>
+    <w:p>
+      <w:pPr>
+        <w:pStyle w:val="CaptionedFigure"/>
+      </w:pPr>
+      <w:r>
+        <w:drawing>
+          <wp:inline>
+            <wp:extent cx="5334000" cy="3616485"/>
+            <wp:effectExtent b="0" l="0" r="0" t="0"/>
+            <wp:docPr descr="Running flutter pub get in the terminal" title="" id="45" name="Picture"/>
+            <a:graphic>
+              <a:graphicData uri="http://schemas.openxmlformats.org/drawingml/2006/picture">
+                <pic:pic>
+                  <pic:nvPicPr>
+                    <pic:cNvPr descr="images/step3_flutter_pub_get.png" id="46" name="Picture"/>
+                    <pic:cNvPicPr>
+                      <a:picLocks noChangeArrowheads="1" noChangeAspect="1"/>
+                    </pic:cNvPicPr>
+                  </pic:nvPicPr>
+                  <pic:blipFill>
+                    <a:blip r:embed="rId44"/>
+                    <a:stretch>
+                      <a:fillRect/>
+                    </a:stretch>
+                  </pic:blipFill>
+                  <pic:spPr bwMode="auto">
+                    <a:xfrm>
+                      <a:off x="0" y="0"/>
+                      <a:ext cx="5334000" cy="3616485"/>
+                    </a:xfrm>
+                    <a:prstGeom prst="rect">
+                      <a:avLst/>
+                    </a:prstGeom>
+                    <a:noFill/>
+                    <a:ln w="9525">
+                      <a:noFill/>
+                      <a:headEnd/>
+                      <a:tailEnd/>
+                    </a:ln>
+                  </pic:spPr>
+                </pic:pic>
+              </a:graphicData>
+            </a:graphic>
+          </wp:inline>
+        </w:drawing>
+      </w:r>
+    </w:p>
+    <w:p>
+      <w:pPr>
+        <w:pStyle w:val="ImageCaption"/>
+      </w:pPr>
+      <w:r>
+        <w:t xml:space="preserve">Running flutter pub get in the terminal</w:t>
+      </w:r>
+    </w:p>
+    <w:bookmarkEnd w:id="47"/>
+    <w:bookmarkStart w:id="57" w:name="run-the-application"/>
+    <w:p>
+      <w:pPr>
+        <w:pStyle w:val="Heading3"/>
+      </w:pPr>
+      <w:r>
+        <w:t xml:space="preserve">Run the Application</w:t>
+      </w:r>
+    </w:p>
+    <w:p>
+      <w:pPr>
+        <w:pStyle w:val="FirstParagraph"/>
+      </w:pPr>
+      <w:r>
+        <w:t xml:space="preserve">This coursework targets Flutter Web and should be viewed in mobile view using your browser’s developer tools. We recommend Chrome or Edge.</w:t>
+      </w:r>
+    </w:p>
+    <w:p>
+      <w:pPr>
+        <w:pStyle w:val="SourceCode"/>
+      </w:pPr>
+      <w:r>
+        <w:rPr>
+          <w:rStyle w:val="ExtensionTok"/>
+        </w:rPr>
+        <w:t xml:space="preserve">flutter</w:t>
+      </w:r>
+      <w:r>
+        <w:rPr>
+          <w:rStyle w:val="NormalTok"/>
+        </w:rPr>
+        <w:t xml:space="preserve"> run </w:t>
+      </w:r>
+      <w:r>
+        <w:rPr>
+          <w:rStyle w:val="AttributeTok"/>
+        </w:rPr>
+        <w:t xml:space="preserve">-d</w:t>
+      </w:r>
+      <w:r>
+        <w:rPr>
+          <w:rStyle w:val="NormalTok"/>
+        </w:rPr>
+        <w:t xml:space="preserve"> chrome</w:t>
+      </w:r>
+    </w:p>
+    <w:p>
+      <w:pPr>
+        <w:pStyle w:val="FirstParagraph"/>
+      </w:pPr>
+      <w:r>
+        <w:t xml:space="preserve">or:</w:t>
+      </w:r>
+    </w:p>
+    <w:p>
+      <w:pPr>
+        <w:pStyle w:val="SourceCode"/>
+      </w:pPr>
+      <w:r>
+        <w:rPr>
+          <w:rStyle w:val="ExtensionTok"/>
+        </w:rPr>
+        <w:t xml:space="preserve">flutter</w:t>
+      </w:r>
+      <w:r>
+        <w:rPr>
+          <w:rStyle w:val="NormalTok"/>
+        </w:rPr>
+        <w:t xml:space="preserve"> run </w:t>
+      </w:r>
+      <w:r>
+        <w:rPr>
+          <w:rStyle w:val="AttributeTok"/>
+        </w:rPr>
+        <w:t xml:space="preserve">-d</w:t>
+      </w:r>
+      <w:r>
+        <w:rPr>
+          <w:rStyle w:val="NormalTok"/>
+        </w:rPr>
+        <w:t xml:space="preserve"> edge</w:t>
+      </w:r>
+    </w:p>
+    <w:p>
+      <w:pPr>
+        <w:pStyle w:val="FirstParagraph"/>
+      </w:pPr>
+      <w:r>
+        <w:t xml:space="preserve">The app should open in your browser and show the Southsea Cinema starter home page:</w:t>
+      </w:r>
+    </w:p>
+    <w:p>
+      <w:pPr>
+        <w:pStyle w:val="CaptionedFigure"/>
+      </w:pPr>
+      <w:r>
+        <w:drawing>
+          <wp:inline>
+            <wp:extent cx="5334000" cy="3000375"/>
+            <wp:effectExtent b="0" l="0" r="0" t="0"/>
+            <wp:docPr descr="Starter app running in Chrome" title="" id="49" name="Picture"/>
+            <a:graphic>
+              <a:graphicData uri="http://schemas.openxmlformats.org/drawingml/2006/picture">
+                <pic:pic>
+                  <pic:nvPicPr>
+                    <pic:cNvPr descr="images/step4_run_app.png" id="50" name="Picture"/>
+                    <pic:cNvPicPr>
+                      <a:picLocks noChangeArrowheads="1" noChangeAspect="1"/>
+                    </pic:cNvPicPr>
+                  </pic:nvPicPr>
+                  <pic:blipFill>
+                    <a:blip r:embed="rId48"/>
+                    <a:stretch>
+                      <a:fillRect/>
+                    </a:stretch>
+                  </pic:blipFill>
+                  <pic:spPr bwMode="auto">
+                    <a:xfrm>
+                      <a:off x="0" y="0"/>
+                      <a:ext cx="5334000" cy="3000375"/>
+                    </a:xfrm>
+                    <a:prstGeom prst="rect">
+                      <a:avLst/>
+                    </a:prstGeom>
+                    <a:noFill/>
+                    <a:ln w="9525">
+                      <a:noFill/>
+                      <a:headEnd/>
+                      <a:tailEnd/>
+                    </a:ln>
+                  </pic:spPr>
+                </pic:pic>
+              </a:graphicData>
+            </a:graphic>
+          </wp:inline>
+        </w:drawing>
+      </w:r>
+    </w:p>
+    <w:p>
+      <w:pPr>
+        <w:pStyle w:val="ImageCaption"/>
+      </w:pPr>
+      <w:r>
+        <w:t xml:space="preserve">Starter app running in Chrome</w:t>
+      </w:r>
+    </w:p>
+    <w:p>
+      <w:pPr>
+        <w:pStyle w:val="BodyText"/>
+      </w:pPr>
+      <w:r>
+        <w:t xml:space="preserve">To view it in mobile view, open developer tools (right-click the page and choose</w:t>
       </w:r>
       <w:r>
         <w:t xml:space="preserve"> </w:t>
@@ -999,21 +1450,10 @@
           <w:b/>
           <w:bCs/>
         </w:rPr>
-        <w:t xml:space="preserve">five stages</w:t>
-      </w:r>
-      <w:r>
-        <w:t xml:space="preserve"> </w:t>
-      </w:r>
-      <w:r>
-        <w:t xml:space="preserve">and demonstrate each stage to a member of staff during a timetabled demo window.</w:t>
-      </w:r>
-    </w:p>
-    <w:p>
-      <w:pPr>
-        <w:pStyle w:val="BodyText"/>
-      </w:pPr>
-      <w:r>
-        <w:t xml:space="preserve">There is no separate sign-off or code submission for Item 1. You submit the</w:t>
+        <w:t xml:space="preserve">Inspect</w:t>
+      </w:r>
+      <w:r>
+        <w:t xml:space="preserve">, or press F12), then click the</w:t>
       </w:r>
       <w:r>
         <w:t xml:space="preserve"> </w:t>
@@ -1023,13 +1463,150 @@
           <w:b/>
           <w:bCs/>
         </w:rPr>
-        <w:t xml:space="preserve">link to your public GitHub repository on Moodle</w:t>
-      </w:r>
-      <w:r>
-        <w:t xml:space="preserve"> </w:t>
-      </w:r>
-      <w:r>
-        <w:t xml:space="preserve">when instructed, then attend the demo windows to show your work. Marks are awarded</w:t>
+        <w:t xml:space="preserve">Toggle device toolbar</w:t>
+      </w:r>
+      <w:r>
+        <w:t xml:space="preserve"> </w:t>
+      </w:r>
+      <w:r>
+        <w:t xml:space="preserve">button:</w:t>
+      </w:r>
+    </w:p>
+    <w:p>
+      <w:pPr>
+        <w:pStyle w:val="CaptionedFigure"/>
+      </w:pPr>
+      <w:r>
+        <w:drawing>
+          <wp:inline>
+            <wp:extent cx="5334000" cy="4292793"/>
+            <wp:effectExtent b="0" l="0" r="0" t="0"/>
+            <wp:docPr descr="Toggle device toolbar button in Chrome DevTools" title="" id="52" name="Picture"/>
+            <a:graphic>
+              <a:graphicData uri="http://schemas.openxmlformats.org/drawingml/2006/picture">
+                <pic:pic>
+                  <pic:nvPicPr>
+                    <pic:cNvPr descr="images/step5_open_devtools.png" id="53" name="Picture"/>
+                    <pic:cNvPicPr>
+                      <a:picLocks noChangeArrowheads="1" noChangeAspect="1"/>
+                    </pic:cNvPicPr>
+                  </pic:nvPicPr>
+                  <pic:blipFill>
+                    <a:blip r:embed="rId51"/>
+                    <a:stretch>
+                      <a:fillRect/>
+                    </a:stretch>
+                  </pic:blipFill>
+                  <pic:spPr bwMode="auto">
+                    <a:xfrm>
+                      <a:off x="0" y="0"/>
+                      <a:ext cx="5334000" cy="4292793"/>
+                    </a:xfrm>
+                    <a:prstGeom prst="rect">
+                      <a:avLst/>
+                    </a:prstGeom>
+                    <a:noFill/>
+                    <a:ln w="9525">
+                      <a:noFill/>
+                      <a:headEnd/>
+                      <a:tailEnd/>
+                    </a:ln>
+                  </pic:spPr>
+                </pic:pic>
+              </a:graphicData>
+            </a:graphic>
+          </wp:inline>
+        </w:drawing>
+      </w:r>
+    </w:p>
+    <w:p>
+      <w:pPr>
+        <w:pStyle w:val="ImageCaption"/>
+      </w:pPr>
+      <w:r>
+        <w:t xml:space="preserve">Toggle device toolbar button in Chrome DevTools</w:t>
+      </w:r>
+    </w:p>
+    <w:p>
+      <w:pPr>
+        <w:pStyle w:val="BodyText"/>
+      </w:pPr>
+      <w:r>
+        <w:t xml:space="preserve">Finally, choose a phone-sized device preset from the dropdown menu:</w:t>
+      </w:r>
+    </w:p>
+    <w:p>
+      <w:pPr>
+        <w:pStyle w:val="CaptionedFigure"/>
+      </w:pPr>
+      <w:r>
+        <w:drawing>
+          <wp:inline>
+            <wp:extent cx="5101389" cy="5717406"/>
+            <wp:effectExtent b="0" l="0" r="0" t="0"/>
+            <wp:docPr descr="Selecting a mobile device preset" title="" id="55" name="Picture"/>
+            <a:graphic>
+              <a:graphicData uri="http://schemas.openxmlformats.org/drawingml/2006/picture">
+                <pic:pic>
+                  <pic:nvPicPr>
+                    <pic:cNvPr descr="images/step5_mobile_view.png" id="56" name="Picture"/>
+                    <pic:cNvPicPr>
+                      <a:picLocks noChangeArrowheads="1" noChangeAspect="1"/>
+                    </pic:cNvPicPr>
+                  </pic:nvPicPr>
+                  <pic:blipFill>
+                    <a:blip r:embed="rId54"/>
+                    <a:stretch>
+                      <a:fillRect/>
+                    </a:stretch>
+                  </pic:blipFill>
+                  <pic:spPr bwMode="auto">
+                    <a:xfrm>
+                      <a:off x="0" y="0"/>
+                      <a:ext cx="5101389" cy="5717406"/>
+                    </a:xfrm>
+                    <a:prstGeom prst="rect">
+                      <a:avLst/>
+                    </a:prstGeom>
+                    <a:noFill/>
+                    <a:ln w="9525">
+                      <a:noFill/>
+                      <a:headEnd/>
+                      <a:tailEnd/>
+                    </a:ln>
+                  </pic:spPr>
+                </pic:pic>
+              </a:graphicData>
+            </a:graphic>
+          </wp:inline>
+        </w:drawing>
+      </w:r>
+    </w:p>
+    <w:p>
+      <w:pPr>
+        <w:pStyle w:val="ImageCaption"/>
+      </w:pPr>
+      <w:r>
+        <w:t xml:space="preserve">Selecting a mobile device preset</w:t>
+      </w:r>
+    </w:p>
+    <w:bookmarkEnd w:id="57"/>
+    <w:bookmarkEnd w:id="58"/>
+    <w:bookmarkStart w:id="60" w:name="assessment-structure"/>
+    <w:p>
+      <w:pPr>
+        <w:pStyle w:val="Heading2"/>
+      </w:pPr>
+      <w:r>
+        <w:t xml:space="preserve">Assessment Structure</w:t>
+      </w:r>
+    </w:p>
+    <w:p>
+      <w:pPr>
+        <w:pStyle w:val="FirstParagraph"/>
+      </w:pPr>
+      <w:r>
+        <w:t xml:space="preserve">Your module (PAPL — M30235, or UXDI — M32605, depending on your cohort) has two assessments. This Southsea Cinema coursework is</w:t>
       </w:r>
       <w:r>
         <w:t xml:space="preserve"> </w:t>
@@ -1039,21 +1616,38 @@
           <w:b/>
           <w:bCs/>
         </w:rPr>
-        <w:t xml:space="preserve">only at the demos</w:t>
-      </w:r>
-      <w:r>
-        <w:t xml:space="preserve">.</w:t>
-      </w:r>
-    </w:p>
-    <w:p>
-      <w:pPr>
-        <w:pStyle w:val="BodyText"/>
-      </w:pPr>
+        <w:t xml:space="preserve">Item 1</w:t>
+      </w:r>
+      <w:r>
+        <w:t xml:space="preserve">, worth</w:t>
+      </w:r>
+      <w:r>
+        <w:t xml:space="preserve"> </w:t>
+      </w:r>
       <w:r>
         <w:rPr>
           <w:b/>
           <w:bCs/>
         </w:rPr>
+        <w:t xml:space="preserve">50% of the overall module mark</w:t>
+      </w:r>
+      <w:r>
+        <w:t xml:space="preserve">. Item 1 is assessed as a portfolio, not as a single submission: you build the app in five stages and demonstrate each stage to a member of staff during a timetabled demo window.</w:t>
+      </w:r>
+    </w:p>
+    <w:p>
+      <w:pPr>
+        <w:pStyle w:val="BodyText"/>
+      </w:pPr>
+      <w:r>
+        <w:t xml:space="preserve">There is no separate sign-off or code submission for Item 1. You submit the link to your public GitHub repository on Moodle when instructed, then attend the demo windows to show your work. Marks are awarded only at the demos.</w:t>
+      </w:r>
+    </w:p>
+    <w:p>
+      <w:pPr>
+        <w:pStyle w:val="BodyText"/>
+      </w:pPr>
+      <w:r>
         <w:t xml:space="preserve">Summary of how the marks work:</w:t>
       </w:r>
     </w:p>
@@ -1066,52 +1660,7 @@
         </w:numPr>
       </w:pPr>
       <w:r>
-        <w:t xml:space="preserve">There are</w:t>
-      </w:r>
-      <w:r>
-        <w:t xml:space="preserve"> </w:t>
-      </w:r>
-      <w:r>
-        <w:rPr>
-          <w:b/>
-          <w:bCs/>
-        </w:rPr>
-        <w:t xml:space="preserve">five demos</w:t>
-      </w:r>
-      <w:r>
-        <w:t xml:space="preserve">, but only your</w:t>
-      </w:r>
-      <w:r>
-        <w:t xml:space="preserve"> </w:t>
-      </w:r>
-      <w:r>
-        <w:rPr>
-          <w:b/>
-          <w:bCs/>
-        </w:rPr>
-        <w:t xml:space="preserve">best four count</w:t>
-      </w:r>
-      <w:r>
-        <w:t xml:space="preserve"> </w:t>
-      </w:r>
-      <w:r>
-        <w:t xml:space="preserve">towards Item 1. The fifth demo is a safety net, so you can miss (or do poorly on)</w:t>
-      </w:r>
-      <w:r>
-        <w:t xml:space="preserve"> </w:t>
-      </w:r>
-      <w:r>
-        <w:rPr>
-          <w:b/>
-          <w:bCs/>
-        </w:rPr>
-        <w:t xml:space="preserve">one</w:t>
-      </w:r>
-      <w:r>
-        <w:t xml:space="preserve"> </w:t>
-      </w:r>
-      <w:r>
-        <w:t xml:space="preserve">demo without harming your mark.</w:t>
+        <w:t xml:space="preserve">There are five demos, but only your best four count towards Item 1. The fifth demo is a safety net, so you can miss (or do poorly on) one demo without harming your mark.</w:t>
       </w:r>
     </w:p>
     <w:p>
@@ -1123,65 +1672,7 @@
         </w:numPr>
       </w:pPr>
       <w:r>
-        <w:t xml:space="preserve">Each demo is worth</w:t>
-      </w:r>
-      <w:r>
-        <w:t xml:space="preserve"> </w:t>
-      </w:r>
-      <w:r>
-        <w:rPr>
-          <w:b/>
-          <w:bCs/>
-        </w:rPr>
-        <w:t xml:space="preserve">25% of Item 1</w:t>
-      </w:r>
-      <w:r>
-        <w:t xml:space="preserve"> </w:t>
-      </w:r>
-      <w:r>
-        <w:t xml:space="preserve">(12.5% of the module). At each demo a member of staff assesses</w:t>
-      </w:r>
-      <w:r>
-        <w:t xml:space="preserve"> </w:t>
-      </w:r>
-      <w:r>
-        <w:rPr>
-          <w:b/>
-          <w:bCs/>
-        </w:rPr>
-        <w:t xml:space="preserve">Functionality (9% of Item 1)</w:t>
-      </w:r>
-      <w:r>
-        <w:t xml:space="preserve"> </w:t>
-      </w:r>
-      <w:r>
-        <w:t xml:space="preserve">by watching you run your app, inspects</w:t>
-      </w:r>
-      <w:r>
-        <w:t xml:space="preserve"> </w:t>
-      </w:r>
-      <w:r>
-        <w:rPr>
-          <w:b/>
-          <w:bCs/>
-        </w:rPr>
-        <w:t xml:space="preserve">Code quality (8%)</w:t>
-      </w:r>
-      <w:r>
-        <w:t xml:space="preserve">, and asks you</w:t>
-      </w:r>
-      <w:r>
-        <w:t xml:space="preserve"> </w:t>
-      </w:r>
-      <w:r>
-        <w:rPr>
-          <w:b/>
-          <w:bCs/>
-        </w:rPr>
-        <w:t xml:space="preserve">two questions to test your understanding of your own code (8%)</w:t>
-      </w:r>
-      <w:r>
-        <w:t xml:space="preserve">.</w:t>
+        <w:t xml:space="preserve">Each demo is worth 25% of Item 1 (12.5% of the module). At each demo a member of staff assesses Functionality (9% of Item 1) by watching you run your app, inspects Code quality (8%), and asks you two questions to test your understanding of your own code (8%).</w:t>
       </w:r>
     </w:p>
     <w:p>
@@ -1193,61 +1684,7 @@
         </w:numPr>
       </w:pPr>
       <w:r>
-        <w:rPr>
-          <w:b/>
-          <w:bCs/>
-        </w:rPr>
-        <w:t xml:space="preserve">Only one demo can take place per window.</w:t>
-      </w:r>
-      <w:r>
-        <w:t xml:space="preserve"> </w:t>
-      </w:r>
-      <w:r>
-        <w:t xml:space="preserve">If you miss a demo, you demonstrate the missed stage at the next window (you lose that window’s slot). Missing one demo does not harm your mark; missing two caps your Item 1 mark at</w:t>
-      </w:r>
-      <w:r>
-        <w:t xml:space="preserve"> </w:t>
-      </w:r>
-      <w:r>
-        <w:rPr>
-          <w:b/>
-          <w:bCs/>
-        </w:rPr>
-        <w:t xml:space="preserve">75% of Item 1</w:t>
-      </w:r>
-      <w:r>
-        <w:t xml:space="preserve"> </w:t>
-      </w:r>
-      <w:r>
-        <w:t xml:space="preserve">(37.5% of the module), and so on.</w:t>
-      </w:r>
-    </w:p>
-    <w:p>
-      <w:pPr>
-        <w:pStyle w:val="Compact"/>
-        <w:numPr>
-          <w:ilvl w:val="0"/>
-          <w:numId w:val="1003"/>
-        </w:numPr>
-      </w:pPr>
-      <w:r>
-        <w:t xml:space="preserve">If you use Firebase or another cloud service, you must</w:t>
-      </w:r>
-      <w:r>
-        <w:t xml:space="preserve"> </w:t>
-      </w:r>
-      <w:r>
-        <w:rPr>
-          <w:b/>
-          <w:bCs/>
-        </w:rPr>
-        <w:t xml:space="preserve">host the app live</w:t>
-      </w:r>
-      <w:r>
-        <w:t xml:space="preserve"> </w:t>
-      </w:r>
-      <w:r>
-        <w:t xml:space="preserve">and provide the URL at the demo so it can be checked without your API keys.</w:t>
+        <w:t xml:space="preserve">Only one demo can take place per window. If you miss a demo, you demonstrate the missed stage at the next window (you lose that window’s slot). Missing one demo does not harm your mark; missing two caps your Item 1 mark at 75% of Item 1 (37.5% of the module), and so on.</w:t>
       </w:r>
     </w:p>
     <w:p>
@@ -1263,40 +1700,20 @@
         <w:pStyle w:val="BodyText"/>
       </w:pPr>
       <w:r>
-        <w:t xml:space="preserve">📄</w:t>
-      </w:r>
-      <w:r>
-        <w:t xml:space="preserve"> </w:t>
-      </w:r>
-      <w:r>
-        <w:rPr>
-          <w:b/>
-          <w:bCs/>
-        </w:rPr>
         <w:t xml:space="preserve">For the full details of how you are assessed — including the exact mark breakdown, the missed-demo rules, and how Extenuating Circumstances affect Item 1 — read the</w:t>
       </w:r>
       <w:r>
-        <w:rPr>
-          <w:b/>
-          <w:bCs/>
-        </w:rPr>
-        <w:t xml:space="preserve"> </w:t>
-      </w:r>
-      <w:hyperlink r:id="rId32">
+        <w:t xml:space="preserve"> </w:t>
+      </w:r>
+      <w:hyperlink r:id="rId59">
         <w:r>
           <w:rPr>
             <w:rStyle w:val="Hyperlink"/>
-            <w:b/>
-            <w:bCs/>
           </w:rPr>
           <w:t xml:space="preserve">Assessment Guide</w:t>
         </w:r>
       </w:hyperlink>
       <w:r>
-        <w:rPr>
-          <w:b/>
-          <w:bCs/>
-        </w:rPr>
         <w:t xml:space="preserve">.</w:t>
       </w:r>
     </w:p>
@@ -1319,25 +1736,11 @@
         </w:r>
       </w:hyperlink>
       <w:r>
-        <w:t xml:space="preserve">. The exact expectations for each demo are listed in the corresponding worksheet and in the demo issue on</w:t>
-      </w:r>
-      <w:r>
-        <w:t xml:space="preserve"> </w:t>
-      </w:r>
-      <w:hyperlink r:id="rId33">
-        <w:r>
-          <w:rPr>
-            <w:rStyle w:val="Hyperlink"/>
-          </w:rPr>
-          <w:t xml:space="preserve">the sandwich_shop repository’s Issues tab</w:t>
-        </w:r>
-      </w:hyperlink>
-      <w:r>
         <w:t xml:space="preserve">.</w:t>
       </w:r>
     </w:p>
-    <w:bookmarkEnd w:id="34"/>
-    <w:bookmarkStart w:id="35" w:name="submission"/>
+    <w:bookmarkEnd w:id="60"/>
+    <w:bookmarkStart w:id="61" w:name="submission"/>
     <w:p>
       <w:pPr>
         <w:pStyle w:val="Heading2"/>
@@ -1362,8 +1765,8 @@
         <w:t xml:space="preserve">Make sure your repository is public. Test this by opening your repository link in a private/incognito browser window (you should not get a 404 error).</w:t>
       </w:r>
     </w:p>
-    <w:bookmarkEnd w:id="35"/>
-    <w:bookmarkStart w:id="36" w:name="demonstration"/>
+    <w:bookmarkEnd w:id="61"/>
+    <w:bookmarkStart w:id="62" w:name="demonstration"/>
     <w:p>
       <w:pPr>
         <w:pStyle w:val="Heading2"/>
@@ -1424,8 +1827,8 @@
         <w:t xml:space="preserve"> chrome</w:t>
       </w:r>
     </w:p>
-    <w:bookmarkEnd w:id="36"/>
-    <w:bookmarkStart w:id="37" w:name="project-structure"/>
+    <w:bookmarkEnd w:id="62"/>
+    <w:bookmarkStart w:id="63" w:name="project-structure"/>
     <w:p>
       <w:pPr>
         <w:pStyle w:val="Heading2"/>
@@ -1560,8 +1963,8 @@
         <w:t xml:space="preserve">Note that this is the initial structure. You are expected to create additional files and directories as needed to complete the coursework, and you can reorganize the project structure as you see fit.</w:t>
       </w:r>
     </w:p>
-    <w:bookmarkEnd w:id="37"/>
-    <w:bookmarkStart w:id="39" w:name="referraldeferral-assessment"/>
+    <w:bookmarkEnd w:id="63"/>
+    <w:bookmarkStart w:id="65" w:name="referraldeferral-assessment"/>
     <w:p>
       <w:pPr>
         <w:pStyle w:val="Heading2"/>
@@ -1580,7 +1983,7 @@
       <w:r>
         <w:t xml:space="preserve"> </w:t>
       </w:r>
-      <w:hyperlink r:id="rId38">
+      <w:hyperlink r:id="rId64">
         <w:r>
           <w:rPr>
             <w:rStyle w:val="Hyperlink"/>
@@ -1597,27 +2000,11 @@
         <w:pStyle w:val="BodyText"/>
       </w:pPr>
       <w:r>
-        <w:t xml:space="preserve">The referral/deferral assessment for this Flutter Course is a coursework that you need to complete during the referral/deferral period. This coursework is</w:t>
-      </w:r>
-      <w:r>
-        <w:t xml:space="preserve"> </w:t>
-      </w:r>
-      <w:r>
-        <w:rPr>
-          <w:b/>
-          <w:bCs/>
-        </w:rPr>
-        <w:t xml:space="preserve">not</w:t>
-      </w:r>
-      <w:r>
-        <w:t xml:space="preserve"> </w:t>
-      </w:r>
-      <w:r>
-        <w:t xml:space="preserve">the same as the coursework brief above. It will be added to Moodle nearer the time.</w:t>
-      </w:r>
-    </w:p>
-    <w:bookmarkEnd w:id="39"/>
-    <w:bookmarkStart w:id="40" w:name="extenuating-circumstances"/>
+        <w:t xml:space="preserve">The referral/deferral assessment for this Flutter Course is a coursework that you need to complete during the referral/deferral period. This coursework is not the same as the coursework brief above. It will be added to Moodle nearer the time.</w:t>
+      </w:r>
+    </w:p>
+    <w:bookmarkEnd w:id="65"/>
+    <w:bookmarkStart w:id="66" w:name="extenuating-circumstances"/>
     <w:p>
       <w:pPr>
         <w:pStyle w:val="Heading2"/>
@@ -1648,23 +2035,7 @@
         <w:t xml:space="preserve"> </w:t>
       </w:r>
       <w:r>
-        <w:t xml:space="preserve">as soon as you can.</w:t>
-      </w:r>
-      <w:r>
-        <w:t xml:space="preserve"> </w:t>
-      </w:r>
-      <w:r>
-        <w:rPr>
-          <w:b/>
-          <w:bCs/>
-        </w:rPr>
-        <w:t xml:space="preserve">You must also tell a member of staff</w:t>
-      </w:r>
-      <w:r>
-        <w:t xml:space="preserve"> </w:t>
-      </w:r>
-      <w:r>
-        <w:t xml:space="preserve">so your Item 1 mark can be handled correctly.</w:t>
+        <w:t xml:space="preserve">as soon as you can. You must also tell a member of staff so your Item 1 mark can be handled correctly.</w:t>
       </w:r>
     </w:p>
     <w:p>
@@ -1680,39 +2051,7 @@
         <w:pStyle w:val="BodyText"/>
       </w:pPr>
       <w:r>
-        <w:t xml:space="preserve">If you have an approved ECF, your Item 1 mark is recorded as</w:t>
-      </w:r>
-      <w:r>
-        <w:t xml:space="preserve"> </w:t>
-      </w:r>
-      <w:r>
-        <w:rPr>
-          <w:b/>
-          <w:bCs/>
-        </w:rPr>
-        <w:t xml:space="preserve">0</w:t>
-      </w:r>
-      <w:r>
-        <w:t xml:space="preserve"> </w:t>
-      </w:r>
-      <w:r>
-        <w:t xml:space="preserve">for the demo portfolio and you are instead expected to take the deferral assessment in July; your Item 1 mark then comes from that deferral coursework alone (not from the demos). However,</w:t>
-      </w:r>
-      <w:r>
-        <w:t xml:space="preserve"> </w:t>
-      </w:r>
-      <w:r>
-        <w:rPr>
-          <w:b/>
-          <w:bCs/>
-        </w:rPr>
-        <w:t xml:space="preserve">if you go on to attend demos and earn marks, those demo marks override the ECF</w:t>
-      </w:r>
-      <w:r>
-        <w:t xml:space="preserve"> </w:t>
-      </w:r>
-      <w:r>
-        <w:t xml:space="preserve">and you will be marked on your demos instead.</w:t>
+        <w:t xml:space="preserve">If you have an approved ECF, your Item 1 mark is recorded as 0 for the demo portfolio and you are instead expected to take the deferral assessment in July; your Item 1 mark then comes from that deferral coursework alone (not from the demos). However, if you go on to attend demos and earn marks, those demo marks override the ECF and you will be marked on your demos instead.</w:t>
       </w:r>
     </w:p>
     <w:p>
@@ -1725,7 +2064,7 @@
       <w:r>
         <w:t xml:space="preserve"> </w:t>
       </w:r>
-      <w:hyperlink r:id="rId32">
+      <w:hyperlink r:id="rId59">
         <w:r>
           <w:rPr>
             <w:rStyle w:val="Hyperlink"/>
@@ -1737,8 +2076,8 @@
         <w:t xml:space="preserve">.</w:t>
       </w:r>
     </w:p>
-    <w:bookmarkEnd w:id="40"/>
-    <w:bookmarkStart w:id="47" w:name="help-with-coursework"/>
+    <w:bookmarkEnd w:id="66"/>
+    <w:bookmarkStart w:id="71" w:name="help-with-coursework"/>
     <w:p>
       <w:pPr>
         <w:pStyle w:val="Heading2"/>
@@ -1747,7 +2086,7 @@
         <w:t xml:space="preserve">Help with Coursework</w:t>
       </w:r>
     </w:p>
-    <w:bookmarkStart w:id="43" w:name="support"/>
+    <w:bookmarkStart w:id="68" w:name="support"/>
     <w:p>
       <w:pPr>
         <w:pStyle w:val="Heading3"/>
@@ -1761,17 +2100,17 @@
         <w:pStyle w:val="FirstParagraph"/>
       </w:pPr>
       <w:r>
-        <w:t xml:space="preserve">If you have questions or encounter issues while working on this coursework, use</w:t>
-      </w:r>
-      <w:r>
-        <w:t xml:space="preserve"> </w:t>
-      </w:r>
-      <w:hyperlink r:id="rId41">
+        <w:t xml:space="preserve">If you have questions or encounter issues while working on this coursework, use the</w:t>
+      </w:r>
+      <w:r>
+        <w:t xml:space="preserve"> </w:t>
+      </w:r>
+      <w:hyperlink r:id="rId67">
         <w:r>
           <w:rPr>
             <w:rStyle w:val="Hyperlink"/>
           </w:rPr>
-          <w:t xml:space="preserve">discord_flutter.pptx</w:t>
+          <w:t xml:space="preserve">Discord guide</w:t>
         </w:r>
       </w:hyperlink>
       <w:r>
@@ -1781,68 +2120,8 @@
         <w:t xml:space="preserve">to find the dedicated Discord channel and ask for help. Before posting a new question, check the existing posts to see if your question has already been answered. You can also attend your timetabled practical sessions to get face-to-face support from teaching staff.</w:t>
       </w:r>
     </w:p>
-    <w:p>
-      <w:pPr>
-        <w:pStyle w:val="BodyText"/>
-      </w:pPr>
-      <w:r>
-        <w:t xml:space="preserve">If you are facing external extenuating circumstances that are affecting your ability to complete this coursework, submit an</w:t>
-      </w:r>
-      <w:r>
-        <w:t xml:space="preserve"> </w:t>
-      </w:r>
-      <w:hyperlink r:id="rId42">
-        <w:r>
-          <w:rPr>
-            <w:rStyle w:val="Hyperlink"/>
-          </w:rPr>
-          <w:t xml:space="preserve">Extenuating Circumstances Form</w:t>
-        </w:r>
-      </w:hyperlink>
-      <w:r>
-        <w:t xml:space="preserve"> </w:t>
-      </w:r>
-      <w:r>
-        <w:t xml:space="preserve">as soon as possible.</w:t>
-      </w:r>
-    </w:p>
-    <w:bookmarkEnd w:id="43"/>
-    <w:bookmarkStart w:id="44" w:name="resources"/>
-    <w:p>
-      <w:pPr>
-        <w:pStyle w:val="Heading3"/>
-      </w:pPr>
-      <w:r>
-        <w:t xml:space="preserve">Resources</w:t>
-      </w:r>
-    </w:p>
-    <w:p>
-      <w:pPr>
-        <w:pStyle w:val="FirstParagraph"/>
-      </w:pPr>
-      <w:r>
-        <w:t xml:space="preserve">The worksheets listed on the</w:t>
-      </w:r>
-      <w:r>
-        <w:t xml:space="preserve"> </w:t>
-      </w:r>
-      <w:hyperlink r:id="rId20">
-        <w:r>
-          <w:rPr>
-            <w:rStyle w:val="Hyperlink"/>
-          </w:rPr>
-          <w:t xml:space="preserve">Flutter Course homepage</w:t>
-        </w:r>
-      </w:hyperlink>
-      <w:r>
-        <w:t xml:space="preserve"> </w:t>
-      </w:r>
-      <w:r>
-        <w:t xml:space="preserve">are your primary learning resource for Flutter development. Work through these worksheets systematically, as they provide the foundation you need to complete the coursework successfully.</w:t>
-      </w:r>
-    </w:p>
-    <w:bookmarkEnd w:id="44"/>
-    <w:bookmarkStart w:id="46" w:name="tips"/>
+    <w:bookmarkEnd w:id="68"/>
+    <w:bookmarkStart w:id="70" w:name="tips"/>
     <w:p>
       <w:pPr>
         <w:pStyle w:val="Heading3"/>
@@ -2023,7 +2302,7 @@
       <w:r>
         <w:t xml:space="preserve"> </w:t>
       </w:r>
-      <w:hyperlink r:id="rId45">
+      <w:hyperlink r:id="rId69">
         <w:r>
           <w:rPr>
             <w:rStyle w:val="Hyperlink"/>
@@ -2035,9 +2314,9 @@
         <w:t xml:space="preserve">. AI-generated code should be reviewed, understood, and adapted to fit your application properly. Use AI as a learning aid and coding partner rather than a replacement for your own understanding and decision-making.</w:t>
       </w:r>
     </w:p>
-    <w:bookmarkEnd w:id="46"/>
-    <w:bookmarkEnd w:id="47"/>
-    <w:bookmarkEnd w:id="48"/>
+    <w:bookmarkEnd w:id="70"/>
+    <w:bookmarkEnd w:id="71"/>
+    <w:bookmarkEnd w:id="72"/>
     <w:sectPr>
       <w:footnotePr>
         <w:numRestart w:val="eachSect"/>

</xml_diff>

<commit_message>
docs: end brief at help section, drop tips
</commit_message>
<xml_diff>
--- a/southsea_cinema_coursework_brief.docx
+++ b/southsea_cinema_coursework_brief.docx
@@ -2,7 +2,7 @@
 <file path=word/document.xml><?xml version="1.0" encoding="utf-8"?>
 <w:document xmlns:w="http://schemas.openxmlformats.org/wordprocessingml/2006/main" xmlns:m="http://schemas.openxmlformats.org/officeDocument/2006/math" xmlns:r="http://schemas.openxmlformats.org/officeDocument/2006/relationships" xmlns:o="urn:schemas-microsoft-com:office:office" xmlns:v="urn:schemas-microsoft-com:vml" xmlns:w10="urn:schemas-microsoft-com:office:word" xmlns:a="http://schemas.openxmlformats.org/drawingml/2006/main" xmlns:pic="http://schemas.openxmlformats.org/drawingml/2006/picture" xmlns:wp="http://schemas.openxmlformats.org/drawingml/2006/wordprocessingDrawing">
   <w:body>
-    <w:bookmarkStart w:id="72" w:name="southsea-cinema-flutter-coursework"/>
+    <w:bookmarkStart w:id="69" w:name="southsea-cinema-flutter-coursework"/>
     <w:p>
       <w:pPr>
         <w:pStyle w:val="Heading1"/>
@@ -2077,22 +2077,13 @@
       </w:r>
     </w:p>
     <w:bookmarkEnd w:id="66"/>
-    <w:bookmarkStart w:id="71" w:name="help-with-coursework"/>
+    <w:bookmarkStart w:id="68" w:name="help-with-coursework"/>
     <w:p>
       <w:pPr>
         <w:pStyle w:val="Heading2"/>
       </w:pPr>
       <w:r>
         <w:t xml:space="preserve">Help with Coursework</w:t>
-      </w:r>
-    </w:p>
-    <w:bookmarkStart w:id="68" w:name="support"/>
-    <w:p>
-      <w:pPr>
-        <w:pStyle w:val="Heading3"/>
-      </w:pPr>
-      <w:r>
-        <w:t xml:space="preserve">Support</w:t>
       </w:r>
     </w:p>
     <w:p>
@@ -2121,202 +2112,7 @@
       </w:r>
     </w:p>
     <w:bookmarkEnd w:id="68"/>
-    <w:bookmarkStart w:id="70" w:name="tips"/>
-    <w:p>
-      <w:pPr>
-        <w:pStyle w:val="Heading3"/>
-      </w:pPr>
-      <w:r>
-        <w:t xml:space="preserve">Tips</w:t>
-      </w:r>
-    </w:p>
-    <w:p>
-      <w:pPr>
-        <w:pStyle w:val="FirstParagraph"/>
-      </w:pPr>
-      <w:r>
-        <w:t xml:space="preserve">Starting early is crucial for success in this coursework. The earlier you begin, the more time you have to learn, experiment, and seek help when needed. Work on the coursework alongside the worksheets rather than leaving everything until the end: as you complete each worksheet, implement the corresponding features in your coursework application.</w:t>
-      </w:r>
-    </w:p>
-    <w:p>
-      <w:pPr>
-        <w:pStyle w:val="BodyText"/>
-      </w:pPr>
-      <w:r>
-        <w:t xml:space="preserve">Version control is an essential part of this coursework. Commit your changes regularly to Git with clear, descriptive commit messages. Each commit should represent a small, meaningful unit of work rather than large batches of changes. To commit and push your changes, use:</w:t>
-      </w:r>
-    </w:p>
-    <w:p>
-      <w:pPr>
-        <w:pStyle w:val="SourceCode"/>
-      </w:pPr>
-      <w:r>
-        <w:rPr>
-          <w:rStyle w:val="FunctionTok"/>
-        </w:rPr>
-        <w:t xml:space="preserve">git</w:t>
-      </w:r>
-      <w:r>
-        <w:rPr>
-          <w:rStyle w:val="NormalTok"/>
-        </w:rPr>
-        <w:t xml:space="preserve"> add .</w:t>
-      </w:r>
-      <w:r>
-        <w:br/>
-      </w:r>
-      <w:r>
-        <w:rPr>
-          <w:rStyle w:val="FunctionTok"/>
-        </w:rPr>
-        <w:t xml:space="preserve">git</w:t>
-      </w:r>
-      <w:r>
-        <w:rPr>
-          <w:rStyle w:val="NormalTok"/>
-        </w:rPr>
-        <w:t xml:space="preserve"> commit </w:t>
-      </w:r>
-      <w:r>
-        <w:rPr>
-          <w:rStyle w:val="AttributeTok"/>
-        </w:rPr>
-        <w:t xml:space="preserve">-m</w:t>
-      </w:r>
-      <w:r>
-        <w:rPr>
-          <w:rStyle w:val="NormalTok"/>
-        </w:rPr>
-        <w:t xml:space="preserve"> </w:t>
-      </w:r>
-      <w:r>
-        <w:rPr>
-          <w:rStyle w:val="StringTok"/>
-        </w:rPr>
-        <w:t xml:space="preserve">"Brief description of what you changed"</w:t>
-      </w:r>
-      <w:r>
-        <w:br/>
-      </w:r>
-      <w:r>
-        <w:rPr>
-          <w:rStyle w:val="FunctionTok"/>
-        </w:rPr>
-        <w:t xml:space="preserve">git</w:t>
-      </w:r>
-      <w:r>
-        <w:rPr>
-          <w:rStyle w:val="NormalTok"/>
-        </w:rPr>
-        <w:t xml:space="preserve"> push</w:t>
-      </w:r>
-    </w:p>
-    <w:p>
-      <w:pPr>
-        <w:pStyle w:val="FirstParagraph"/>
-      </w:pPr>
-      <w:r>
-        <w:t xml:space="preserve">If you make a mistake and need to revert to a previous commit, view your commit history with</w:t>
-      </w:r>
-      <w:r>
-        <w:t xml:space="preserve"> </w:t>
-      </w:r>
-      <w:r>
-        <w:rPr>
-          <w:rStyle w:val="VerbatimChar"/>
-        </w:rPr>
-        <w:t xml:space="preserve">git log --oneline</w:t>
-      </w:r>
-      <w:r>
-        <w:t xml:space="preserve">, find the commit hash where things were working (for example,</w:t>
-      </w:r>
-      <w:r>
-        <w:t xml:space="preserve"> </w:t>
-      </w:r>
-      <w:r>
-        <w:rPr>
-          <w:rStyle w:val="VerbatimChar"/>
-        </w:rPr>
-        <w:t xml:space="preserve">abc1234</w:t>
-      </w:r>
-      <w:r>
-        <w:t xml:space="preserve">), and revert to that commit with</w:t>
-      </w:r>
-      <w:r>
-        <w:t xml:space="preserve"> </w:t>
-      </w:r>
-      <w:r>
-        <w:rPr>
-          <w:rStyle w:val="VerbatimChar"/>
-        </w:rPr>
-        <w:t xml:space="preserve">git reset --hard abc1234</w:t>
-      </w:r>
-      <w:r>
-        <w:t xml:space="preserve">. If necessary, you can force push with</w:t>
-      </w:r>
-      <w:r>
-        <w:t xml:space="preserve"> </w:t>
-      </w:r>
-      <w:r>
-        <w:rPr>
-          <w:rStyle w:val="VerbatimChar"/>
-        </w:rPr>
-        <w:t xml:space="preserve">git push --force</w:t>
-      </w:r>
-      <w:r>
-        <w:t xml:space="preserve">.</w:t>
-      </w:r>
-    </w:p>
-    <w:p>
-      <w:pPr>
-        <w:pStyle w:val="BodyText"/>
-      </w:pPr>
-      <w:r>
-        <w:t xml:space="preserve">In extreme cases where your repository is completely broken and unrecoverable, you can start fresh by deleting your forked repository on GitHub (Settings → Danger Zone → Delete this repository), forking the</w:t>
-      </w:r>
-      <w:r>
-        <w:t xml:space="preserve"> </w:t>
-      </w:r>
-      <w:hyperlink r:id="rId19">
-        <w:r>
-          <w:rPr>
-            <w:rStyle w:val="Hyperlink"/>
-          </w:rPr>
-          <w:t xml:space="preserve">southsea_cinema repository</w:t>
-        </w:r>
-      </w:hyperlink>
-      <w:r>
-        <w:t xml:space="preserve"> </w:t>
-      </w:r>
-      <w:r>
-        <w:t xml:space="preserve">again, and cloning your fresh fork.</w:t>
-      </w:r>
-    </w:p>
-    <w:p>
-      <w:pPr>
-        <w:pStyle w:val="BodyText"/>
-      </w:pPr>
-      <w:r>
-        <w:t xml:space="preserve">AI tools are valuable during development, and you are encouraged to use them. However, you must apply the best practices taught in the worksheets, particularly</w:t>
-      </w:r>
-      <w:r>
-        <w:t xml:space="preserve"> </w:t>
-      </w:r>
-      <w:hyperlink r:id="rId69">
-        <w:r>
-          <w:rPr>
-            <w:rStyle w:val="Hyperlink"/>
-          </w:rPr>
-          <w:t xml:space="preserve">Worksheet 6</w:t>
-        </w:r>
-      </w:hyperlink>
-      <w:r>
-        <w:t xml:space="preserve">. AI-generated code should be reviewed, understood, and adapted to fit your application properly. Use AI as a learning aid and coding partner rather than a replacement for your own understanding and decision-making.</w:t>
-      </w:r>
-    </w:p>
-    <w:bookmarkEnd w:id="70"/>
-    <w:bookmarkEnd w:id="71"/>
-    <w:bookmarkEnd w:id="72"/>
+    <w:bookmarkEnd w:id="69"/>
     <w:sectPr>
       <w:footnotePr>
         <w:numRestart w:val="eachSect"/>

</xml_diff>

<commit_message>
docs(assessment): sync coursework documents with OneDrive
</commit_message>
<xml_diff>
--- a/southsea_cinema_coursework_brief.docx
+++ b/southsea_cinema_coursework_brief.docx
@@ -2,27 +2,20 @@
 <file path=word/document2.xml><?xml version="1.0" encoding="utf-8"?>
 <w:document xmlns:wpc="http://schemas.microsoft.com/office/word/2010/wordprocessingCanvas" xmlns:mc="http://schemas.openxmlformats.org/markup-compatibility/2006" xmlns:o="urn:schemas-microsoft-com:office:office" xmlns:r="http://schemas.openxmlformats.org/officeDocument/2006/relationships" xmlns:m="http://schemas.openxmlformats.org/officeDocument/2006/math" xmlns:v="urn:schemas-microsoft-com:vml" xmlns:wp14="http://schemas.microsoft.com/office/word/2010/wordprocessingDrawing" xmlns:wp="http://schemas.openxmlformats.org/drawingml/2006/wordprocessingDrawing" xmlns:w10="urn:schemas-microsoft-com:office:word" xmlns:w="http://schemas.openxmlformats.org/wordprocessingml/2006/main" xmlns:w14="http://schemas.microsoft.com/office/word/2010/wordml" xmlns:w15="http://schemas.microsoft.com/office/word/2012/wordml" xmlns:wpg="http://schemas.microsoft.com/office/word/2010/wordprocessingGroup" xmlns:wpi="http://schemas.microsoft.com/office/word/2010/wordprocessingInk" xmlns:wne="http://schemas.microsoft.com/office/word/2006/wordml" xmlns:wps="http://schemas.microsoft.com/office/word/2010/wordprocessingShape" xmlns:w16se="http://schemas.microsoft.com/office/word/2015/wordml/symex" xmlns:w16cid="http://schemas.microsoft.com/office/word/2016/wordml/cid" xmlns:w16="http://schemas.microsoft.com/office/word/2018/wordml" xmlns:w16cex="http://schemas.microsoft.com/office/word/2018/wordml/cex" xmlns:w16sdtdh="http://schemas.microsoft.com/office/word/2020/wordml/sdtdatahash" xmlns:w16sdtfl="http://schemas.microsoft.com/office/word/2024/wordml/sdtformatlock" xmlns:a="http://schemas.openxmlformats.org/drawingml/2006/main" xmlns:pic="http://schemas.openxmlformats.org/drawingml/2006/picture" xmlns:a14="http://schemas.microsoft.com/office/drawing/2010/main" mc:Ignorable="w14 w15 wp14 w16se w16cid w16 w16cex w16sdtdh w16sdtfl">
   <w:body>
-    <w:p xmlns:wp14="http://schemas.microsoft.com/office/word/2010/wordml" wp14:paraId="5FB57DCF" wp14:textId="683F89B0">
+    <w:p xmlns:wp14="http://schemas.microsoft.com/office/word/2010/wordml" wp14:paraId="5FB57DCF" wp14:textId="5107ED91">
       <w:pPr>
         <w:spacing w:after="160"/>
         <w:rPr>
-          <w:rFonts w:ascii="Arial" w:hAnsi="Arial" w:eastAsia="Arial" w:cs="Arial"/>
-          <w:b w:val="0"/>
-          <w:bCs w:val="0"/>
-          <w:i w:val="0"/>
-          <w:iCs w:val="0"/>
-          <w:caps w:val="0"/>
-          <w:smallCaps w:val="0"/>
-          <w:noProof w:val="0"/>
-          <w:color w:val="000000" w:themeColor="text1" w:themeTint="FF" w:themeShade="FF"/>
-          <w:sz w:val="28"/>
-          <w:szCs w:val="28"/>
+          <w:rFonts w:ascii="Aptos" w:hAnsi="Aptos" w:eastAsia="Aptos" w:cs="Aptos" w:asciiTheme="minorAscii" w:hAnsiTheme="minorAscii" w:eastAsiaTheme="minorAscii" w:cstheme="minorAscii"/>
+          <w:noProof w:val="0"/>
+          <w:sz w:val="32"/>
+          <w:szCs w:val="32"/>
           <w:lang w:val="en-GB"/>
         </w:rPr>
       </w:pPr>
       <w:r>
         <w:drawing>
-          <wp:inline xmlns:wp14="http://schemas.microsoft.com/office/word/2010/wordprocessingDrawing" wp14:editId="56F7B0B4" wp14:anchorId="203E7B52">
+          <wp:inline xmlns:wp14="http://schemas.microsoft.com/office/word/2010/wordprocessingDrawing" wp14:editId="6B05795C" wp14:anchorId="203E7B52">
             <wp:extent cx="1019175" cy="1181100"/>
             <wp:effectExtent l="0" t="0" r="0" b="0"/>
             <wp:docPr id="1098071563" name="drawing" title="University of Portsmouth Logo"/>
@@ -65,20 +58,11 @@
       </w:r>
       <w:r>
         <w:rPr>
-          <w:rFonts w:ascii="Arial" w:hAnsi="Arial" w:eastAsia="Arial" w:cs="Arial"/>
-          <w:b w:val="1"/>
-          <w:bCs w:val="1"/>
-          <w:i w:val="0"/>
-          <w:iCs w:val="0"/>
-          <w:caps w:val="0"/>
-          <w:smallCaps w:val="0"/>
-          <w:noProof w:val="0"/>
-          <w:color w:val="000000" w:themeColor="text1" w:themeTint="FF" w:themeShade="FF"/>
+          <w:rFonts w:ascii="Aptos" w:hAnsi="Aptos" w:eastAsia="Aptos" w:cs="Aptos" w:asciiTheme="minorAscii" w:hAnsiTheme="minorAscii" w:eastAsiaTheme="minorAscii" w:cstheme="minorAscii"/>
           <w:sz w:val="28"/>
           <w:szCs w:val="28"/>
-          <w:lang w:val="en-US"/>
-        </w:rPr>
-        <w:t>School of Computing</w:t>
+        </w:rPr>
+        <w:t>School of Computing, Mathematics and Physics 2026/27</w:t>
       </w:r>
     </w:p>
     <w:tbl>
@@ -314,7 +298,7 @@
                 <w:lang w:val="en-US"/>
               </w:rPr>
             </w:pPr>
-            <w:hyperlink r:id="R9b4e15ffdd2b4317">
+            <w:hyperlink r:id="Rb2460dbaf39447ca">
               <w:r>
                 <w:rPr>
                   <w:rStyle w:val="Hyperlink"/>
@@ -362,7 +346,7 @@
               </w:rPr>
               <w:t>(</w:t>
             </w:r>
-            <w:hyperlink r:id="Ra9be0186fd6841e2">
+            <w:hyperlink r:id="R3061ca8ec42d4cfa">
               <w:r>
                 <w:rPr>
                   <w:rStyle w:val="Hyperlink"/>
@@ -794,7 +778,7 @@
         <w:bidi w:val="0"/>
         <w:spacing w:before="240" w:after="0"/>
         <w:rPr>
-          <w:rFonts w:ascii="Arial" w:hAnsi="Arial" w:eastAsia="Arial" w:cs="Arial"/>
+          <w:rFonts w:ascii="Aptos" w:hAnsi="Aptos" w:eastAsia="Aptos" w:cs="Aptos" w:asciiTheme="minorAscii" w:hAnsiTheme="minorAscii" w:eastAsiaTheme="minorAscii" w:cstheme="minorAscii"/>
           <w:b w:val="0"/>
           <w:bCs w:val="0"/>
           <w:i w:val="0"/>
@@ -810,7 +794,7 @@
       </w:pPr>
       <w:r>
         <w:rPr>
-          <w:rFonts w:ascii="Arial" w:hAnsi="Arial" w:eastAsia="Arial" w:cs="Arial"/>
+          <w:rFonts w:ascii="Aptos" w:hAnsi="Aptos" w:eastAsia="Aptos" w:cs="Aptos" w:asciiTheme="minorAscii" w:hAnsiTheme="minorAscii" w:eastAsiaTheme="minorAscii" w:cstheme="minorAscii"/>
           <w:b w:val="1"/>
           <w:bCs w:val="1"/>
           <w:i w:val="0"/>
@@ -830,7 +814,7 @@
       <w:tblPr>
         <w:tblStyle w:val="TableNormal"/>
         <w:bidiVisual w:val="0"/>
-        <w:tblW w:w="0" w:type="auto"/>
+        <w:tblW w:w="9285" w:type="dxa"/>
         <w:tblInd w:w="45" w:type="dxa"/>
         <w:tblBorders>
           <w:top w:val="single" w:sz="6"/>
@@ -842,8 +826,8 @@
       </w:tblPr>
       <w:tblGrid>
         <w:gridCol w:w="1185"/>
-        <w:gridCol w:w="5235"/>
-        <w:gridCol w:w="750"/>
+        <w:gridCol w:w="5130"/>
+        <w:gridCol w:w="855"/>
         <w:gridCol w:w="2115"/>
       </w:tblGrid>
       <w:tr>
@@ -873,7 +857,7 @@
               <w:bidi w:val="0"/>
               <w:spacing w:after="0" w:line="240" w:lineRule="auto"/>
               <w:rPr>
-                <w:rFonts w:ascii="Arial" w:hAnsi="Arial" w:eastAsia="Arial" w:cs="Arial"/>
+                <w:rFonts w:ascii="Aptos" w:hAnsi="Aptos" w:eastAsia="Aptos" w:cs="Aptos" w:asciiTheme="minorAscii" w:hAnsiTheme="minorAscii" w:eastAsiaTheme="minorAscii" w:cstheme="minorAscii"/>
                 <w:b w:val="0"/>
                 <w:bCs w:val="0"/>
                 <w:i w:val="0"/>
@@ -884,7 +868,7 @@
             </w:pPr>
             <w:r>
               <w:rPr>
-                <w:rFonts w:ascii="Arial" w:hAnsi="Arial" w:eastAsia="Arial" w:cs="Arial"/>
+                <w:rFonts w:ascii="Aptos" w:hAnsi="Aptos" w:eastAsia="Aptos" w:cs="Aptos" w:asciiTheme="minorAscii" w:hAnsiTheme="minorAscii" w:eastAsiaTheme="minorAscii" w:cstheme="minorAscii"/>
                 <w:b w:val="0"/>
                 <w:bCs w:val="0"/>
                 <w:i w:val="0"/>
@@ -899,7 +883,7 @@
         </w:tc>
         <w:tc>
           <w:tcPr>
-            <w:tcW w:w="5235" w:type="dxa"/>
+            <w:tcW w:w="5130" w:type="dxa"/>
             <w:tcBorders>
               <w:top w:val="single" w:color="000000" w:themeColor="text1" w:sz="8"/>
               <w:left w:val="single" w:color="000000" w:themeColor="text1" w:sz="8"/>
@@ -920,7 +904,7 @@
               <w:bidi w:val="0"/>
               <w:spacing w:after="0"/>
               <w:rPr>
-                <w:rFonts w:ascii="Arial" w:hAnsi="Arial" w:eastAsia="Arial" w:cs="Arial"/>
+                <w:rFonts w:ascii="Aptos" w:hAnsi="Aptos" w:eastAsia="Aptos" w:cs="Aptos" w:asciiTheme="minorAscii" w:hAnsiTheme="minorAscii" w:eastAsiaTheme="minorAscii" w:cstheme="minorAscii"/>
                 <w:b w:val="0"/>
                 <w:bCs w:val="0"/>
                 <w:i w:val="0"/>
@@ -931,7 +915,7 @@
             </w:pPr>
             <w:r>
               <w:rPr>
-                <w:rFonts w:ascii="Arial" w:hAnsi="Arial" w:eastAsia="Arial" w:cs="Arial"/>
+                <w:rFonts w:ascii="Aptos" w:hAnsi="Aptos" w:eastAsia="Aptos" w:cs="Aptos" w:asciiTheme="minorAscii" w:hAnsiTheme="minorAscii" w:eastAsiaTheme="minorAscii" w:cstheme="minorAscii"/>
                 <w:b w:val="0"/>
                 <w:bCs w:val="0"/>
                 <w:i w:val="0"/>
@@ -946,7 +930,7 @@
         </w:tc>
         <w:tc>
           <w:tcPr>
-            <w:tcW w:w="750" w:type="dxa"/>
+            <w:tcW w:w="855" w:type="dxa"/>
             <w:tcBorders>
               <w:top w:val="single" w:color="000000" w:themeColor="text1" w:sz="8"/>
               <w:left w:val="single" w:color="000000" w:themeColor="text1" w:sz="8"/>
@@ -963,22 +947,15 @@
           </w:tcPr>
           <w:p>
             <w:pPr>
+              <w:pStyle w:val="Normal"/>
               <w:widowControl w:val="0"/>
+              <w:suppressLineNumbers w:val="0"/>
               <w:bidi w:val="0"/>
-              <w:spacing w:after="0" w:line="240" w:lineRule="auto"/>
+              <w:spacing w:before="0" w:beforeAutospacing="off" w:after="0" w:afterAutospacing="off" w:line="240" w:lineRule="auto"/>
+              <w:ind w:left="0" w:right="0"/>
+              <w:jc w:val="left"/>
               <w:rPr>
-                <w:rFonts w:ascii="Arial" w:hAnsi="Arial" w:eastAsia="Arial" w:cs="Arial"/>
-                <w:b w:val="0"/>
-                <w:bCs w:val="0"/>
-                <w:i w:val="0"/>
-                <w:iCs w:val="0"/>
-                <w:sz w:val="18"/>
-                <w:szCs w:val="18"/>
-              </w:rPr>
-            </w:pPr>
-            <w:r>
-              <w:rPr>
-                <w:rFonts w:ascii="Arial" w:hAnsi="Arial" w:eastAsia="Arial" w:cs="Arial"/>
+                <w:rFonts w:ascii="Aptos" w:hAnsi="Aptos" w:eastAsia="Aptos" w:cs="Aptos" w:asciiTheme="minorAscii" w:hAnsiTheme="minorAscii" w:eastAsiaTheme="minorAscii" w:cstheme="minorAscii"/>
                 <w:b w:val="0"/>
                 <w:bCs w:val="0"/>
                 <w:i w:val="0"/>
@@ -987,7 +964,19 @@
                 <w:szCs w:val="18"/>
                 <w:lang w:val="en-US"/>
               </w:rPr>
-              <w:t>Value</w:t>
+            </w:pPr>
+            <w:r>
+              <w:rPr>
+                <w:rFonts w:ascii="Aptos" w:hAnsi="Aptos" w:eastAsia="Aptos" w:cs="Aptos" w:asciiTheme="minorAscii" w:hAnsiTheme="minorAscii" w:eastAsiaTheme="minorAscii" w:cstheme="minorAscii"/>
+                <w:b w:val="0"/>
+                <w:bCs w:val="0"/>
+                <w:i w:val="0"/>
+                <w:iCs w:val="0"/>
+                <w:sz w:val="18"/>
+                <w:szCs w:val="18"/>
+                <w:lang w:val="en-US"/>
+              </w:rPr>
+              <w:t>Weight</w:t>
             </w:r>
           </w:p>
         </w:tc>
@@ -1017,10 +1006,20 @@
               <w:spacing w:before="0" w:beforeAutospacing="off" w:after="0" w:afterAutospacing="off" w:line="240" w:lineRule="auto"/>
               <w:ind w:left="0" w:right="0"/>
               <w:jc w:val="left"/>
+              <w:rPr>
+                <w:rFonts w:ascii="Aptos" w:hAnsi="Aptos" w:eastAsia="Aptos" w:cs="Aptos" w:asciiTheme="minorAscii" w:hAnsiTheme="minorAscii" w:eastAsiaTheme="minorAscii" w:cstheme="minorAscii"/>
+                <w:b w:val="0"/>
+                <w:bCs w:val="0"/>
+                <w:i w:val="0"/>
+                <w:iCs w:val="0"/>
+                <w:sz w:val="18"/>
+                <w:szCs w:val="18"/>
+                <w:lang w:val="en-US"/>
+              </w:rPr>
             </w:pPr>
             <w:r>
               <w:rPr>
-                <w:rFonts w:ascii="Arial" w:hAnsi="Arial" w:eastAsia="Arial" w:cs="Arial"/>
+                <w:rFonts w:ascii="Aptos" w:hAnsi="Aptos" w:eastAsia="Aptos" w:cs="Aptos" w:asciiTheme="minorAscii" w:hAnsiTheme="minorAscii" w:eastAsiaTheme="minorAscii" w:cstheme="minorAscii"/>
                 <w:b w:val="0"/>
                 <w:bCs w:val="0"/>
                 <w:i w:val="0"/>
@@ -1061,7 +1060,7 @@
               <w:bidi w:val="0"/>
               <w:spacing w:after="0" w:line="360" w:lineRule="auto"/>
               <w:rPr>
-                <w:rFonts w:ascii="Arial" w:hAnsi="Arial" w:eastAsia="Arial" w:cs="Arial"/>
+                <w:rFonts w:ascii="Aptos" w:hAnsi="Aptos" w:eastAsia="Aptos" w:cs="Aptos" w:asciiTheme="minorAscii" w:hAnsiTheme="minorAscii" w:eastAsiaTheme="minorAscii" w:cstheme="minorAscii"/>
                 <w:b w:val="0"/>
                 <w:bCs w:val="0"/>
                 <w:i w:val="0"/>
@@ -1072,7 +1071,7 @@
             </w:pPr>
             <w:r>
               <w:rPr>
-                <w:rFonts w:ascii="Arial" w:hAnsi="Arial" w:eastAsia="Arial" w:cs="Arial"/>
+                <w:rFonts w:ascii="Aptos" w:hAnsi="Aptos" w:eastAsia="Aptos" w:cs="Aptos" w:asciiTheme="minorAscii" w:hAnsiTheme="minorAscii" w:eastAsiaTheme="minorAscii" w:cstheme="minorAscii"/>
                 <w:b w:val="0"/>
                 <w:bCs w:val="0"/>
                 <w:i w:val="0"/>
@@ -1087,7 +1086,7 @@
         </w:tc>
         <w:tc>
           <w:tcPr>
-            <w:tcW w:w="5235" w:type="dxa"/>
+            <w:tcW w:w="5130" w:type="dxa"/>
             <w:tcBorders>
               <w:top w:val="single" w:color="000000" w:themeColor="text1" w:sz="8"/>
               <w:left w:val="single" w:color="000000" w:themeColor="text1" w:sz="8"/>
@@ -1108,7 +1107,7 @@
               <w:bidi w:val="0"/>
               <w:spacing w:after="0" w:line="360" w:lineRule="auto"/>
               <w:rPr>
-                <w:rFonts w:ascii="Arial" w:hAnsi="Arial" w:eastAsia="Arial" w:cs="Arial"/>
+                <w:rFonts w:ascii="Aptos" w:hAnsi="Aptos" w:eastAsia="Aptos" w:cs="Aptos" w:asciiTheme="minorAscii" w:hAnsiTheme="minorAscii" w:eastAsiaTheme="minorAscii" w:cstheme="minorAscii"/>
                 <w:b w:val="0"/>
                 <w:bCs w:val="0"/>
                 <w:i w:val="0"/>
@@ -1119,7 +1118,7 @@
             </w:pPr>
             <w:r>
               <w:rPr>
-                <w:rFonts w:ascii="Arial" w:hAnsi="Arial" w:eastAsia="Arial" w:cs="Arial"/>
+                <w:rFonts w:ascii="Aptos" w:hAnsi="Aptos" w:eastAsia="Aptos" w:cs="Aptos" w:asciiTheme="minorAscii" w:hAnsiTheme="minorAscii" w:eastAsiaTheme="minorAscii" w:cstheme="minorAscii"/>
                 <w:b w:val="0"/>
                 <w:bCs w:val="0"/>
                 <w:i w:val="0"/>
@@ -1132,7 +1131,7 @@
             </w:r>
             <w:r>
               <w:rPr>
-                <w:rFonts w:ascii="Arial" w:hAnsi="Arial" w:eastAsia="Arial" w:cs="Arial"/>
+                <w:rFonts w:ascii="Aptos" w:hAnsi="Aptos" w:eastAsia="Aptos" w:cs="Aptos" w:asciiTheme="minorAscii" w:hAnsiTheme="minorAscii" w:eastAsiaTheme="minorAscii" w:cstheme="minorAscii"/>
                 <w:b w:val="0"/>
                 <w:bCs w:val="0"/>
                 <w:i w:val="0"/>
@@ -1145,7 +1144,7 @@
             </w:r>
             <w:r>
               <w:rPr>
-                <w:rFonts w:ascii="Arial" w:hAnsi="Arial" w:eastAsia="Arial" w:cs="Arial"/>
+                <w:rFonts w:ascii="Aptos" w:hAnsi="Aptos" w:eastAsia="Aptos" w:cs="Aptos" w:asciiTheme="minorAscii" w:hAnsiTheme="minorAscii" w:eastAsiaTheme="minorAscii" w:cstheme="minorAscii"/>
                 <w:b w:val="0"/>
                 <w:bCs w:val="0"/>
                 <w:i w:val="0"/>
@@ -1158,7 +1157,7 @@
             </w:r>
             <w:r>
               <w:rPr>
-                <w:rFonts w:ascii="Arial" w:hAnsi="Arial" w:eastAsia="Arial" w:cs="Arial"/>
+                <w:rFonts w:ascii="Aptos" w:hAnsi="Aptos" w:eastAsia="Aptos" w:cs="Aptos" w:asciiTheme="minorAscii" w:hAnsiTheme="minorAscii" w:eastAsiaTheme="minorAscii" w:cstheme="minorAscii"/>
                 <w:b w:val="0"/>
                 <w:bCs w:val="0"/>
                 <w:i w:val="0"/>
@@ -1171,7 +1170,7 @@
             </w:r>
             <w:r>
               <w:rPr>
-                <w:rFonts w:ascii="Arial" w:hAnsi="Arial" w:eastAsia="Arial" w:cs="Arial"/>
+                <w:rFonts w:ascii="Aptos" w:hAnsi="Aptos" w:eastAsia="Aptos" w:cs="Aptos" w:asciiTheme="minorAscii" w:hAnsiTheme="minorAscii" w:eastAsiaTheme="minorAscii" w:cstheme="minorAscii"/>
                 <w:b w:val="0"/>
                 <w:bCs w:val="0"/>
                 <w:i w:val="0"/>
@@ -1186,7 +1185,7 @@
         </w:tc>
         <w:tc>
           <w:tcPr>
-            <w:tcW w:w="750" w:type="dxa"/>
+            <w:tcW w:w="855" w:type="dxa"/>
             <w:vMerge w:val="restart"/>
             <w:tcBorders>
               <w:top w:val="single" w:color="000000" w:themeColor="text1" w:sz="8"/>
@@ -1208,7 +1207,7 @@
               <w:bidi w:val="0"/>
               <w:spacing w:after="0" w:line="360" w:lineRule="auto"/>
               <w:rPr>
-                <w:rFonts w:ascii="Arial" w:hAnsi="Arial" w:eastAsia="Arial" w:cs="Arial"/>
+                <w:rFonts w:ascii="Aptos" w:hAnsi="Aptos" w:eastAsia="Aptos" w:cs="Aptos" w:asciiTheme="minorAscii" w:hAnsiTheme="minorAscii" w:eastAsiaTheme="minorAscii" w:cstheme="minorAscii"/>
                 <w:b w:val="0"/>
                 <w:bCs w:val="0"/>
                 <w:i w:val="0"/>
@@ -1219,7 +1218,7 @@
             </w:pPr>
             <w:r>
               <w:rPr>
-                <w:rFonts w:ascii="Arial" w:hAnsi="Arial" w:eastAsia="Arial" w:cs="Arial"/>
+                <w:rFonts w:ascii="Aptos" w:hAnsi="Aptos" w:eastAsia="Aptos" w:cs="Aptos" w:asciiTheme="minorAscii" w:hAnsiTheme="minorAscii" w:eastAsiaTheme="minorAscii" w:cstheme="minorAscii"/>
                 <w:b w:val="0"/>
                 <w:bCs w:val="0"/>
                 <w:i w:val="0"/>
@@ -1255,10 +1254,20 @@
               <w:widowControl w:val="0"/>
               <w:bidi w:val="0"/>
               <w:spacing w:after="0" w:line="360" w:lineRule="auto"/>
+              <w:rPr>
+                <w:rFonts w:ascii="Aptos" w:hAnsi="Aptos" w:eastAsia="Aptos" w:cs="Aptos" w:asciiTheme="minorAscii" w:hAnsiTheme="minorAscii" w:eastAsiaTheme="minorAscii" w:cstheme="minorAscii"/>
+                <w:b w:val="0"/>
+                <w:bCs w:val="0"/>
+                <w:i w:val="0"/>
+                <w:iCs w:val="0"/>
+                <w:sz w:val="18"/>
+                <w:szCs w:val="18"/>
+                <w:lang w:val="en-US"/>
+              </w:rPr>
             </w:pPr>
             <w:r>
               <w:rPr>
-                <w:rFonts w:ascii="Arial" w:hAnsi="Arial" w:eastAsia="Arial" w:cs="Arial"/>
+                <w:rFonts w:ascii="Aptos" w:hAnsi="Aptos" w:eastAsia="Aptos" w:cs="Aptos" w:asciiTheme="minorAscii" w:hAnsiTheme="minorAscii" w:eastAsiaTheme="minorAscii" w:cstheme="minorAscii"/>
                 <w:b w:val="0"/>
                 <w:bCs w:val="0"/>
                 <w:i w:val="0"/>
@@ -1271,7 +1280,7 @@
             </w:r>
             <w:r>
               <w:rPr>
-                <w:rFonts w:ascii="Arial" w:hAnsi="Arial" w:eastAsia="Arial" w:cs="Arial"/>
+                <w:rFonts w:ascii="Aptos" w:hAnsi="Aptos" w:eastAsia="Aptos" w:cs="Aptos" w:asciiTheme="minorAscii" w:hAnsiTheme="minorAscii" w:eastAsiaTheme="minorAscii" w:cstheme="minorAscii"/>
                 <w:b w:val="0"/>
                 <w:bCs w:val="0"/>
                 <w:i w:val="0"/>
@@ -1284,7 +1293,7 @@
             </w:r>
             <w:r>
               <w:rPr>
-                <w:rFonts w:ascii="Arial" w:hAnsi="Arial" w:eastAsia="Arial" w:cs="Arial"/>
+                <w:rFonts w:ascii="Aptos" w:hAnsi="Aptos" w:eastAsia="Aptos" w:cs="Aptos" w:asciiTheme="minorAscii" w:hAnsiTheme="minorAscii" w:eastAsiaTheme="minorAscii" w:cstheme="minorAscii"/>
                 <w:b w:val="0"/>
                 <w:bCs w:val="0"/>
                 <w:i w:val="0"/>
@@ -1301,10 +1310,20 @@
               <w:widowControl w:val="0"/>
               <w:bidi w:val="0"/>
               <w:spacing w:after="0" w:line="360" w:lineRule="auto"/>
+              <w:rPr>
+                <w:rFonts w:ascii="Aptos" w:hAnsi="Aptos" w:eastAsia="Aptos" w:cs="Aptos" w:asciiTheme="minorAscii" w:hAnsiTheme="minorAscii" w:eastAsiaTheme="minorAscii" w:cstheme="minorAscii"/>
+                <w:b w:val="0"/>
+                <w:bCs w:val="0"/>
+                <w:i w:val="0"/>
+                <w:iCs w:val="0"/>
+                <w:sz w:val="18"/>
+                <w:szCs w:val="18"/>
+                <w:lang w:val="en-US"/>
+              </w:rPr>
             </w:pPr>
             <w:r>
               <w:rPr>
-                <w:rFonts w:ascii="Arial" w:hAnsi="Arial" w:eastAsia="Arial" w:cs="Arial"/>
+                <w:rFonts w:ascii="Aptos" w:hAnsi="Aptos" w:eastAsia="Aptos" w:cs="Aptos" w:asciiTheme="minorAscii" w:hAnsiTheme="minorAscii" w:eastAsiaTheme="minorAscii" w:cstheme="minorAscii"/>
                 <w:b w:val="0"/>
                 <w:bCs w:val="0"/>
                 <w:i w:val="0"/>
@@ -1321,10 +1340,20 @@
               <w:widowControl w:val="0"/>
               <w:bidi w:val="0"/>
               <w:spacing w:after="0" w:line="360" w:lineRule="auto"/>
+              <w:rPr>
+                <w:rFonts w:ascii="Aptos" w:hAnsi="Aptos" w:eastAsia="Aptos" w:cs="Aptos" w:asciiTheme="minorAscii" w:hAnsiTheme="minorAscii" w:eastAsiaTheme="minorAscii" w:cstheme="minorAscii"/>
+                <w:b w:val="0"/>
+                <w:bCs w:val="0"/>
+                <w:i w:val="0"/>
+                <w:iCs w:val="0"/>
+                <w:sz w:val="18"/>
+                <w:szCs w:val="18"/>
+                <w:lang w:val="en-US"/>
+              </w:rPr>
             </w:pPr>
             <w:r>
               <w:rPr>
-                <w:rFonts w:ascii="Arial" w:hAnsi="Arial" w:eastAsia="Arial" w:cs="Arial"/>
+                <w:rFonts w:ascii="Aptos" w:hAnsi="Aptos" w:eastAsia="Aptos" w:cs="Aptos" w:asciiTheme="minorAscii" w:hAnsiTheme="minorAscii" w:eastAsiaTheme="minorAscii" w:cstheme="minorAscii"/>
                 <w:b w:val="0"/>
                 <w:bCs w:val="0"/>
                 <w:i w:val="0"/>
@@ -1341,10 +1370,20 @@
               <w:widowControl w:val="0"/>
               <w:bidi w:val="0"/>
               <w:spacing w:after="0" w:line="360" w:lineRule="auto"/>
+              <w:rPr>
+                <w:rFonts w:ascii="Aptos" w:hAnsi="Aptos" w:eastAsia="Aptos" w:cs="Aptos" w:asciiTheme="minorAscii" w:hAnsiTheme="minorAscii" w:eastAsiaTheme="minorAscii" w:cstheme="minorAscii"/>
+                <w:b w:val="0"/>
+                <w:bCs w:val="0"/>
+                <w:i w:val="0"/>
+                <w:iCs w:val="0"/>
+                <w:sz w:val="18"/>
+                <w:szCs w:val="18"/>
+                <w:lang w:val="en-US"/>
+              </w:rPr>
             </w:pPr>
             <w:r>
               <w:rPr>
-                <w:rFonts w:ascii="Arial" w:hAnsi="Arial" w:eastAsia="Arial" w:cs="Arial"/>
+                <w:rFonts w:ascii="Aptos" w:hAnsi="Aptos" w:eastAsia="Aptos" w:cs="Aptos" w:asciiTheme="minorAscii" w:hAnsiTheme="minorAscii" w:eastAsiaTheme="minorAscii" w:cstheme="minorAscii"/>
                 <w:b w:val="0"/>
                 <w:bCs w:val="0"/>
                 <w:i w:val="0"/>
@@ -1361,10 +1400,20 @@
               <w:widowControl w:val="0"/>
               <w:bidi w:val="0"/>
               <w:spacing w:after="0" w:line="360" w:lineRule="auto"/>
+              <w:rPr>
+                <w:rFonts w:ascii="Aptos" w:hAnsi="Aptos" w:eastAsia="Aptos" w:cs="Aptos" w:asciiTheme="minorAscii" w:hAnsiTheme="minorAscii" w:eastAsiaTheme="minorAscii" w:cstheme="minorAscii"/>
+                <w:b w:val="0"/>
+                <w:bCs w:val="0"/>
+                <w:i w:val="0"/>
+                <w:iCs w:val="0"/>
+                <w:sz w:val="18"/>
+                <w:szCs w:val="18"/>
+                <w:lang w:val="en-US"/>
+              </w:rPr>
             </w:pPr>
             <w:r>
               <w:rPr>
-                <w:rFonts w:ascii="Arial" w:hAnsi="Arial" w:eastAsia="Arial" w:cs="Arial"/>
+                <w:rFonts w:ascii="Aptos" w:hAnsi="Aptos" w:eastAsia="Aptos" w:cs="Aptos" w:asciiTheme="minorAscii" w:hAnsiTheme="minorAscii" w:eastAsiaTheme="minorAscii" w:cstheme="minorAscii"/>
                 <w:b w:val="0"/>
                 <w:bCs w:val="0"/>
                 <w:i w:val="0"/>
@@ -1405,7 +1454,7 @@
               <w:bidi w:val="0"/>
               <w:spacing w:after="0" w:line="360" w:lineRule="auto"/>
               <w:rPr>
-                <w:rFonts w:ascii="Arial" w:hAnsi="Arial" w:eastAsia="Arial" w:cs="Arial"/>
+                <w:rFonts w:ascii="Aptos" w:hAnsi="Aptos" w:eastAsia="Aptos" w:cs="Aptos" w:asciiTheme="minorAscii" w:hAnsiTheme="minorAscii" w:eastAsiaTheme="minorAscii" w:cstheme="minorAscii"/>
                 <w:b w:val="0"/>
                 <w:bCs w:val="0"/>
                 <w:i w:val="0"/>
@@ -1416,7 +1465,7 @@
             </w:pPr>
             <w:r>
               <w:rPr>
-                <w:rFonts w:ascii="Arial" w:hAnsi="Arial" w:eastAsia="Arial" w:cs="Arial"/>
+                <w:rFonts w:ascii="Aptos" w:hAnsi="Aptos" w:eastAsia="Aptos" w:cs="Aptos" w:asciiTheme="minorAscii" w:hAnsiTheme="minorAscii" w:eastAsiaTheme="minorAscii" w:cstheme="minorAscii"/>
                 <w:b w:val="0"/>
                 <w:bCs w:val="0"/>
                 <w:i w:val="0"/>
@@ -1431,7 +1480,7 @@
         </w:tc>
         <w:tc>
           <w:tcPr>
-            <w:tcW w:w="5235" w:type="dxa"/>
+            <w:tcW w:w="5130" w:type="dxa"/>
             <w:tcBorders>
               <w:top w:val="single" w:color="000000" w:themeColor="text1" w:sz="8"/>
               <w:left w:val="single" w:color="000000" w:themeColor="text1" w:sz="8"/>
@@ -1451,10 +1500,20 @@
               <w:widowControl w:val="0"/>
               <w:bidi w:val="0"/>
               <w:spacing w:after="0" w:line="360" w:lineRule="auto"/>
+              <w:rPr>
+                <w:rFonts w:ascii="Aptos" w:hAnsi="Aptos" w:eastAsia="Aptos" w:cs="Aptos" w:asciiTheme="minorAscii" w:hAnsiTheme="minorAscii" w:eastAsiaTheme="minorAscii" w:cstheme="minorAscii"/>
+                <w:b w:val="0"/>
+                <w:bCs w:val="0"/>
+                <w:i w:val="0"/>
+                <w:iCs w:val="0"/>
+                <w:sz w:val="18"/>
+                <w:szCs w:val="18"/>
+                <w:lang w:val="en-US"/>
+              </w:rPr>
             </w:pPr>
             <w:r>
               <w:rPr>
-                <w:rFonts w:ascii="Arial" w:hAnsi="Arial" w:eastAsia="Arial" w:cs="Arial"/>
+                <w:rFonts w:ascii="Aptos" w:hAnsi="Aptos" w:eastAsia="Aptos" w:cs="Aptos" w:asciiTheme="minorAscii" w:hAnsiTheme="minorAscii" w:eastAsiaTheme="minorAscii" w:cstheme="minorAscii"/>
                 <w:b w:val="0"/>
                 <w:bCs w:val="0"/>
                 <w:i w:val="0"/>
@@ -1467,7 +1526,7 @@
             </w:r>
             <w:r>
               <w:rPr>
-                <w:rFonts w:ascii="Arial" w:hAnsi="Arial" w:eastAsia="Arial" w:cs="Arial"/>
+                <w:rFonts w:ascii="Aptos" w:hAnsi="Aptos" w:eastAsia="Aptos" w:cs="Aptos" w:asciiTheme="minorAscii" w:hAnsiTheme="minorAscii" w:eastAsiaTheme="minorAscii" w:cstheme="minorAscii"/>
                 <w:b w:val="0"/>
                 <w:bCs w:val="0"/>
                 <w:i w:val="0"/>
@@ -1481,7 +1540,7 @@
             <w:bookmarkStart w:name="_Int_axS8LJR3" w:id="1950577793"/>
             <w:r>
               <w:rPr>
-                <w:rFonts w:ascii="Arial" w:hAnsi="Arial" w:eastAsia="Arial" w:cs="Arial"/>
+                <w:rFonts w:ascii="Aptos" w:hAnsi="Aptos" w:eastAsia="Aptos" w:cs="Aptos" w:asciiTheme="minorAscii" w:hAnsiTheme="minorAscii" w:eastAsiaTheme="minorAscii" w:cstheme="minorAscii"/>
                 <w:b w:val="0"/>
                 <w:bCs w:val="0"/>
                 <w:i w:val="0"/>
@@ -1495,7 +1554,7 @@
             <w:bookmarkEnd w:id="1950577793"/>
             <w:r>
               <w:rPr>
-                <w:rFonts w:ascii="Arial" w:hAnsi="Arial" w:eastAsia="Arial" w:cs="Arial"/>
+                <w:rFonts w:ascii="Aptos" w:hAnsi="Aptos" w:eastAsia="Aptos" w:cs="Aptos" w:asciiTheme="minorAscii" w:hAnsiTheme="minorAscii" w:eastAsiaTheme="minorAscii" w:cstheme="minorAscii"/>
                 <w:b w:val="0"/>
                 <w:bCs w:val="0"/>
                 <w:i w:val="0"/>
@@ -1508,7 +1567,7 @@
             </w:r>
             <w:r>
               <w:rPr>
-                <w:rFonts w:ascii="Arial" w:hAnsi="Arial" w:eastAsia="Arial" w:cs="Arial"/>
+                <w:rFonts w:ascii="Aptos" w:hAnsi="Aptos" w:eastAsia="Aptos" w:cs="Aptos" w:asciiTheme="minorAscii" w:hAnsiTheme="minorAscii" w:eastAsiaTheme="minorAscii" w:cstheme="minorAscii"/>
                 <w:b w:val="0"/>
                 <w:bCs w:val="0"/>
                 <w:i w:val="0"/>
@@ -1526,7 +1585,7 @@
               <w:bidi w:val="0"/>
               <w:spacing w:after="0" w:line="360" w:lineRule="auto"/>
               <w:rPr>
-                <w:rFonts w:ascii="Arial" w:hAnsi="Arial" w:eastAsia="Arial" w:cs="Arial"/>
+                <w:rFonts w:ascii="Aptos" w:hAnsi="Aptos" w:eastAsia="Aptos" w:cs="Aptos" w:asciiTheme="minorAscii" w:hAnsiTheme="minorAscii" w:eastAsiaTheme="minorAscii" w:cstheme="minorAscii"/>
                 <w:b w:val="0"/>
                 <w:bCs w:val="0"/>
                 <w:i w:val="0"/>
@@ -1537,7 +1596,7 @@
             </w:pPr>
             <w:r>
               <w:rPr>
-                <w:rFonts w:ascii="Arial" w:hAnsi="Arial" w:eastAsia="Arial" w:cs="Arial"/>
+                <w:rFonts w:ascii="Aptos" w:hAnsi="Aptos" w:eastAsia="Aptos" w:cs="Aptos" w:asciiTheme="minorAscii" w:hAnsiTheme="minorAscii" w:eastAsiaTheme="minorAscii" w:cstheme="minorAscii"/>
                 <w:b w:val="0"/>
                 <w:bCs w:val="0"/>
                 <w:i w:val="0"/>
@@ -1552,14 +1611,9 @@
         </w:tc>
         <w:tc>
           <w:tcPr>
-            <w:tcW w:w="750" w:type="dxa"/>
+            <w:tcW w:w="855" w:type="dxa"/>
             <w:vMerge/>
-            <w:tcBorders>
-              <w:top w:val="single" w:color="000000" w:themeColor="text1" w:sz="0"/>
-              <w:left w:val="single" w:color="000000" w:themeColor="text1" w:sz="0"/>
-              <w:bottom w:val="single" w:color="000000" w:themeColor="text1" w:sz="0"/>
-              <w:right w:val="single" w:color="000000" w:themeColor="text1" w:sz="0"/>
-            </w:tcBorders>
+            <w:tcBorders/>
             <w:tcMar/>
             <w:vAlign w:val="center"/>
           </w:tcPr>
@@ -1569,11 +1623,7 @@
           <w:tcPr>
             <w:tcW w:w="2115" w:type="dxa"/>
             <w:vMerge/>
-            <w:tcBorders>
-              <w:left w:val="single" w:color="000000" w:themeColor="text1" w:sz="8"/>
-              <w:bottom w:val="single" w:color="000000" w:themeColor="text1" w:sz="8"/>
-              <w:right w:val="single" w:color="000000" w:themeColor="text1" w:sz="8"/>
-            </w:tcBorders>
+            <w:tcBorders/>
             <w:tcMar>
               <w:top w:w="90" w:type="dxa"/>
               <w:left w:w="90" w:type="dxa"/>
@@ -1591,7 +1641,7 @@
         <w:bidi w:val="0"/>
         <w:spacing w:before="120" w:after="120" w:line="240" w:lineRule="auto"/>
         <w:rPr>
-          <w:rFonts w:ascii="Arial" w:hAnsi="Arial" w:eastAsia="Arial" w:cs="Arial"/>
+          <w:rFonts w:ascii="Aptos" w:hAnsi="Aptos" w:eastAsia="Aptos" w:cs="Aptos" w:asciiTheme="minorAscii" w:hAnsiTheme="minorAscii" w:eastAsiaTheme="minorAscii" w:cstheme="minorAscii"/>
           <w:b w:val="0"/>
           <w:bCs w:val="0"/>
           <w:i w:val="0"/>
@@ -1607,7 +1657,7 @@
       </w:pPr>
       <w:r>
         <w:rPr>
-          <w:rFonts w:ascii="Arial" w:hAnsi="Arial" w:eastAsia="Arial" w:cs="Arial"/>
+          <w:rFonts w:ascii="Aptos" w:hAnsi="Aptos" w:eastAsia="Aptos" w:cs="Aptos" w:asciiTheme="minorAscii" w:hAnsiTheme="minorAscii" w:eastAsiaTheme="minorAscii" w:cstheme="minorAscii"/>
           <w:b w:val="1"/>
           <w:bCs w:val="1"/>
           <w:i w:val="0"/>
@@ -1633,7 +1683,7 @@
         <w:bidi w:val="0"/>
         <w:spacing w:before="80" w:after="80" w:line="240" w:lineRule="auto"/>
         <w:rPr>
-          <w:rFonts w:ascii="Aptos Display" w:hAnsi="Aptos Display" w:eastAsia="Aptos Display" w:cs="Aptos Display"/>
+          <w:rFonts w:ascii="Aptos" w:hAnsi="Aptos" w:eastAsia="Aptos" w:cs="Aptos" w:asciiTheme="minorAscii" w:hAnsiTheme="minorAscii" w:eastAsiaTheme="minorAscii" w:cstheme="minorAscii"/>
           <w:b w:val="0"/>
           <w:bCs w:val="0"/>
           <w:i w:val="0"/>
@@ -1649,7 +1699,7 @@
       </w:pPr>
       <w:r>
         <w:rPr>
-          <w:rFonts w:ascii="Aptos Display" w:hAnsi="Aptos Display" w:eastAsia="Aptos Display" w:cs="Aptos Display"/>
+          <w:rFonts w:ascii="Aptos" w:hAnsi="Aptos" w:eastAsia="Aptos" w:cs="Aptos" w:asciiTheme="minorAscii" w:hAnsiTheme="minorAscii" w:eastAsiaTheme="minorAscii" w:cstheme="minorAscii"/>
           <w:b w:val="0"/>
           <w:bCs w:val="0"/>
           <w:i w:val="0"/>
@@ -1664,11 +1714,11 @@
         </w:rPr>
         <w:t xml:space="preserve">The </w:t>
       </w:r>
-      <w:hyperlink r:id="R4763ea3cac934706">
+      <w:hyperlink r:id="R9c17ee1df19f4005">
         <w:r>
           <w:rPr>
             <w:rStyle w:val="Hyperlink"/>
-            <w:rFonts w:ascii="Aptos Display" w:hAnsi="Aptos Display" w:eastAsia="Aptos Display" w:cs="Aptos Display"/>
+            <w:rFonts w:ascii="Aptos" w:hAnsi="Aptos" w:eastAsia="Aptos" w:cs="Aptos" w:asciiTheme="minorAscii" w:hAnsiTheme="minorAscii" w:eastAsiaTheme="minorAscii" w:cstheme="minorAscii"/>
             <w:b w:val="0"/>
             <w:bCs w:val="0"/>
             <w:i w:val="0"/>
@@ -1689,7 +1739,7 @@
       </w:hyperlink>
       <w:r>
         <w:rPr>
-          <w:rFonts w:ascii="Aptos Display" w:hAnsi="Aptos Display" w:eastAsia="Aptos Display" w:cs="Aptos Display"/>
+          <w:rFonts w:ascii="Aptos" w:hAnsi="Aptos" w:eastAsia="Aptos" w:cs="Aptos" w:asciiTheme="minorAscii" w:hAnsiTheme="minorAscii" w:eastAsiaTheme="minorAscii" w:cstheme="minorAscii"/>
           <w:b w:val="0"/>
           <w:bCs w:val="0"/>
           <w:i w:val="0"/>
@@ -1706,7 +1756,7 @@
       </w:r>
       <w:r>
         <w:rPr>
-          <w:rFonts w:ascii="Aptos Display" w:hAnsi="Aptos Display" w:eastAsia="Aptos Display" w:cs="Aptos Display"/>
+          <w:rFonts w:ascii="Aptos" w:hAnsi="Aptos" w:eastAsia="Aptos" w:cs="Aptos" w:asciiTheme="minorAscii" w:hAnsiTheme="minorAscii" w:eastAsiaTheme="minorAscii" w:cstheme="minorAscii"/>
           <w:b w:val="0"/>
           <w:bCs w:val="0"/>
           <w:i w:val="0"/>
@@ -1732,7 +1782,7 @@
         <w:bidi w:val="0"/>
         <w:spacing w:before="80" w:after="80" w:line="240" w:lineRule="auto"/>
         <w:rPr>
-          <w:rFonts w:ascii="Aptos Display" w:hAnsi="Aptos Display" w:eastAsia="Aptos Display" w:cs="Aptos Display"/>
+          <w:rFonts w:ascii="Aptos" w:hAnsi="Aptos" w:eastAsia="Aptos" w:cs="Aptos" w:asciiTheme="minorAscii" w:hAnsiTheme="minorAscii" w:eastAsiaTheme="minorAscii" w:cstheme="minorAscii"/>
           <w:b w:val="0"/>
           <w:bCs w:val="0"/>
           <w:i w:val="0"/>
@@ -1749,11 +1799,11 @@
           <w:lang w:val="en-US"/>
         </w:rPr>
       </w:pPr>
-      <w:hyperlink r:id="R709670f844b246f0">
+      <w:hyperlink r:id="Rdf8fc2aaeaaa439f">
         <w:r>
           <w:rPr>
             <w:rStyle w:val="Hyperlink"/>
-            <w:rFonts w:ascii="Aptos Display" w:hAnsi="Aptos Display" w:eastAsia="Aptos Display" w:cs="Aptos Display"/>
+            <w:rFonts w:ascii="Aptos" w:hAnsi="Aptos" w:eastAsia="Aptos" w:cs="Aptos" w:asciiTheme="minorAscii" w:hAnsiTheme="minorAscii" w:eastAsiaTheme="minorAscii" w:cstheme="minorAscii"/>
             <w:b w:val="0"/>
             <w:bCs w:val="0"/>
             <w:i w:val="0"/>
@@ -1774,7 +1824,7 @@
       </w:hyperlink>
       <w:r>
         <w:rPr>
-          <w:rFonts w:ascii="Aptos Display" w:hAnsi="Aptos Display" w:eastAsia="Aptos Display" w:cs="Aptos Display"/>
+          <w:rFonts w:ascii="Aptos" w:hAnsi="Aptos" w:eastAsia="Aptos" w:cs="Aptos" w:asciiTheme="minorAscii" w:hAnsiTheme="minorAscii" w:eastAsiaTheme="minorAscii" w:cstheme="minorAscii"/>
           <w:b w:val="0"/>
           <w:bCs w:val="0"/>
           <w:i w:val="0"/>
@@ -1791,7 +1841,7 @@
       </w:r>
       <w:r>
         <w:rPr>
-          <w:rFonts w:ascii="Aptos Display" w:hAnsi="Aptos Display" w:eastAsia="Aptos Display" w:cs="Aptos Display"/>
+          <w:rFonts w:ascii="Aptos" w:hAnsi="Aptos" w:eastAsia="Aptos" w:cs="Aptos" w:asciiTheme="minorAscii" w:hAnsiTheme="minorAscii" w:eastAsiaTheme="minorAscii" w:cstheme="minorAscii"/>
           <w:b w:val="0"/>
           <w:bCs w:val="0"/>
           <w:i w:val="0"/>
@@ -1808,7 +1858,7 @@
       </w:r>
       <w:r>
         <w:rPr>
-          <w:rFonts w:ascii="Aptos Display" w:hAnsi="Aptos Display" w:eastAsia="Aptos Display" w:cs="Aptos Display"/>
+          <w:rFonts w:ascii="Aptos" w:hAnsi="Aptos" w:eastAsia="Aptos" w:cs="Aptos" w:asciiTheme="minorAscii" w:hAnsiTheme="minorAscii" w:eastAsiaTheme="minorAscii" w:cstheme="minorAscii"/>
           <w:b w:val="0"/>
           <w:bCs w:val="0"/>
           <w:i w:val="0"/>
@@ -1825,7 +1875,7 @@
       </w:r>
       <w:r>
         <w:rPr>
-          <w:rFonts w:ascii="Aptos Display" w:hAnsi="Aptos Display" w:eastAsia="Aptos Display" w:cs="Aptos Display"/>
+          <w:rFonts w:ascii="Aptos" w:hAnsi="Aptos" w:eastAsia="Aptos" w:cs="Aptos" w:asciiTheme="minorAscii" w:hAnsiTheme="minorAscii" w:eastAsiaTheme="minorAscii" w:cstheme="minorAscii"/>
           <w:b w:val="0"/>
           <w:bCs w:val="0"/>
           <w:i w:val="0"/>
@@ -1842,7 +1892,7 @@
       </w:r>
       <w:r>
         <w:rPr>
-          <w:rFonts w:ascii="Aptos Display" w:hAnsi="Aptos Display" w:eastAsia="Aptos Display" w:cs="Aptos Display"/>
+          <w:rFonts w:ascii="Aptos" w:hAnsi="Aptos" w:eastAsia="Aptos" w:cs="Aptos" w:asciiTheme="minorAscii" w:hAnsiTheme="minorAscii" w:eastAsiaTheme="minorAscii" w:cstheme="minorAscii"/>
           <w:b w:val="0"/>
           <w:bCs w:val="0"/>
           <w:i w:val="0"/>
@@ -1859,7 +1909,7 @@
       </w:r>
       <w:r>
         <w:rPr>
-          <w:rFonts w:ascii="Aptos Display" w:hAnsi="Aptos Display" w:eastAsia="Aptos Display" w:cs="Aptos Display"/>
+          <w:rFonts w:ascii="Aptos" w:hAnsi="Aptos" w:eastAsia="Aptos" w:cs="Aptos" w:asciiTheme="minorAscii" w:hAnsiTheme="minorAscii" w:eastAsiaTheme="minorAscii" w:cstheme="minorAscii"/>
           <w:b w:val="0"/>
           <w:bCs w:val="0"/>
           <w:i w:val="0"/>
@@ -1876,7 +1926,7 @@
       </w:r>
       <w:r>
         <w:rPr>
-          <w:rFonts w:ascii="Aptos Display" w:hAnsi="Aptos Display" w:eastAsia="Aptos Display" w:cs="Aptos Display"/>
+          <w:rFonts w:ascii="Aptos" w:hAnsi="Aptos" w:eastAsia="Aptos" w:cs="Aptos" w:asciiTheme="minorAscii" w:hAnsiTheme="minorAscii" w:eastAsiaTheme="minorAscii" w:cstheme="minorAscii"/>
           <w:b w:val="0"/>
           <w:bCs w:val="0"/>
           <w:i w:val="0"/>
@@ -1902,7 +1952,7 @@
         <w:bidi w:val="0"/>
         <w:spacing w:before="80" w:after="80" w:line="240" w:lineRule="auto"/>
         <w:rPr>
-          <w:rFonts w:ascii="Aptos Display" w:hAnsi="Aptos Display" w:eastAsia="Aptos Display" w:cs="Aptos Display"/>
+          <w:rFonts w:ascii="Aptos" w:hAnsi="Aptos" w:eastAsia="Aptos" w:cs="Aptos" w:asciiTheme="minorAscii" w:hAnsiTheme="minorAscii" w:eastAsiaTheme="minorAscii" w:cstheme="minorAscii"/>
           <w:b w:val="0"/>
           <w:bCs w:val="0"/>
           <w:i w:val="0"/>
@@ -1918,7 +1968,7 @@
       </w:pPr>
       <w:r>
         <w:rPr>
-          <w:rFonts w:ascii="Aptos Display" w:hAnsi="Aptos Display" w:eastAsia="Aptos Display" w:cs="Aptos Display"/>
+          <w:rFonts w:ascii="Aptos" w:hAnsi="Aptos" w:eastAsia="Aptos" w:cs="Aptos" w:asciiTheme="minorAscii" w:hAnsiTheme="minorAscii" w:eastAsiaTheme="minorAscii" w:cstheme="minorAscii"/>
           <w:b w:val="0"/>
           <w:bCs w:val="0"/>
           <w:i w:val="0"/>
@@ -1933,11 +1983,11 @@
         </w:rPr>
         <w:t xml:space="preserve">The University takes any form of academic misconduct (such as plagiarism) seriously, so please make sure your work is your own. Please ensure you adhere to our </w:t>
       </w:r>
-      <w:hyperlink r:id="Rd295fc02adfd4484">
+      <w:hyperlink r:id="R485e79aad6f24031">
         <w:r>
           <w:rPr>
             <w:rStyle w:val="Hyperlink"/>
-            <w:rFonts w:ascii="Aptos Display" w:hAnsi="Aptos Display" w:eastAsia="Aptos Display" w:cs="Aptos Display"/>
+            <w:rFonts w:ascii="Aptos" w:hAnsi="Aptos" w:eastAsia="Aptos" w:cs="Aptos" w:asciiTheme="minorAscii" w:hAnsiTheme="minorAscii" w:eastAsiaTheme="minorAscii" w:cstheme="minorAscii"/>
             <w:b w:val="0"/>
             <w:bCs w:val="0"/>
             <w:i w:val="0"/>
@@ -1958,7 +2008,7 @@
       </w:hyperlink>
       <w:r>
         <w:rPr>
-          <w:rFonts w:ascii="Aptos Display" w:hAnsi="Aptos Display" w:eastAsia="Aptos Display" w:cs="Aptos Display"/>
+          <w:rFonts w:ascii="Aptos" w:hAnsi="Aptos" w:eastAsia="Aptos" w:cs="Aptos" w:asciiTheme="minorAscii" w:hAnsiTheme="minorAscii" w:eastAsiaTheme="minorAscii" w:cstheme="minorAscii"/>
           <w:b w:val="0"/>
           <w:bCs w:val="0"/>
           <w:i w:val="0"/>
@@ -1975,7 +2025,7 @@
       </w:r>
       <w:r>
         <w:rPr>
-          <w:rFonts w:ascii="Aptos Display" w:hAnsi="Aptos Display" w:eastAsia="Aptos Display" w:cs="Aptos Display"/>
+          <w:rFonts w:ascii="Aptos" w:hAnsi="Aptos" w:eastAsia="Aptos" w:cs="Aptos" w:asciiTheme="minorAscii" w:hAnsiTheme="minorAscii" w:eastAsiaTheme="minorAscii" w:cstheme="minorAscii"/>
           <w:b w:val="0"/>
           <w:bCs w:val="0"/>
           <w:i w:val="0"/>
@@ -1990,11 +2040,11 @@
         </w:rPr>
         <w:t xml:space="preserve">and watch the video on </w:t>
       </w:r>
-      <w:hyperlink r:id="R9a492d857ad54419">
+      <w:hyperlink r:id="R1506ea341f3840ef">
         <w:r>
           <w:rPr>
             <w:rStyle w:val="Hyperlink"/>
-            <w:rFonts w:ascii="Aptos Display" w:hAnsi="Aptos Display" w:eastAsia="Aptos Display" w:cs="Aptos Display"/>
+            <w:rFonts w:ascii="Aptos" w:hAnsi="Aptos" w:eastAsia="Aptos" w:cs="Aptos" w:asciiTheme="minorAscii" w:hAnsiTheme="minorAscii" w:eastAsiaTheme="minorAscii" w:cstheme="minorAscii"/>
             <w:b w:val="0"/>
             <w:bCs w:val="0"/>
             <w:i w:val="0"/>
@@ -2024,7 +2074,7 @@
         <w:bidi w:val="0"/>
         <w:spacing w:before="80" w:after="80" w:line="240" w:lineRule="auto"/>
         <w:rPr>
-          <w:rFonts w:ascii="Aptos Display" w:hAnsi="Aptos Display" w:eastAsia="Aptos Display" w:cs="Aptos Display"/>
+          <w:rFonts w:ascii="Aptos" w:hAnsi="Aptos" w:eastAsia="Aptos" w:cs="Aptos" w:asciiTheme="minorAscii" w:hAnsiTheme="minorAscii" w:eastAsiaTheme="minorAscii" w:cstheme="minorAscii"/>
           <w:b w:val="0"/>
           <w:bCs w:val="0"/>
           <w:i w:val="0"/>
@@ -2040,7 +2090,7 @@
       </w:pPr>
       <w:r>
         <w:rPr>
-          <w:rFonts w:ascii="Aptos Display" w:hAnsi="Aptos Display" w:eastAsia="Aptos Display" w:cs="Aptos Display"/>
+          <w:rFonts w:ascii="Aptos" w:hAnsi="Aptos" w:eastAsia="Aptos" w:cs="Aptos" w:asciiTheme="minorAscii" w:hAnsiTheme="minorAscii" w:eastAsiaTheme="minorAscii" w:cstheme="minorAscii"/>
           <w:b w:val="0"/>
           <w:bCs w:val="0"/>
           <w:i w:val="0"/>
@@ -2057,7 +2107,7 @@
       </w:r>
       <w:r>
         <w:rPr>
-          <w:rFonts w:ascii="Aptos Display" w:hAnsi="Aptos Display" w:eastAsia="Aptos Display" w:cs="Aptos Display"/>
+          <w:rFonts w:ascii="Aptos" w:hAnsi="Aptos" w:eastAsia="Aptos" w:cs="Aptos" w:asciiTheme="minorAscii" w:hAnsiTheme="minorAscii" w:eastAsiaTheme="minorAscii" w:cstheme="minorAscii"/>
           <w:b w:val="0"/>
           <w:bCs w:val="0"/>
           <w:i w:val="0"/>
@@ -2074,7 +2124,7 @@
       </w:r>
       <w:r>
         <w:rPr>
-          <w:rFonts w:ascii="Aptos Display" w:hAnsi="Aptos Display" w:eastAsia="Aptos Display" w:cs="Aptos Display"/>
+          <w:rFonts w:ascii="Aptos" w:hAnsi="Aptos" w:eastAsia="Aptos" w:cs="Aptos" w:asciiTheme="minorAscii" w:hAnsiTheme="minorAscii" w:eastAsiaTheme="minorAscii" w:cstheme="minorAscii"/>
           <w:b w:val="0"/>
           <w:bCs w:val="0"/>
           <w:i w:val="0"/>
@@ -2089,11 +2139,11 @@
         </w:rPr>
         <w:t xml:space="preserve"> format. Detailed advice on referencing is available from the </w:t>
       </w:r>
-      <w:hyperlink r:id="Rb6f15f008a894c87">
+      <w:hyperlink r:id="Re88e460808604342">
         <w:r>
           <w:rPr>
             <w:rStyle w:val="Hyperlink"/>
-            <w:rFonts w:ascii="Aptos Display" w:hAnsi="Aptos Display" w:eastAsia="Aptos Display" w:cs="Aptos Display"/>
+            <w:rFonts w:ascii="Aptos" w:hAnsi="Aptos" w:eastAsia="Aptos" w:cs="Aptos" w:asciiTheme="minorAscii" w:hAnsiTheme="minorAscii" w:eastAsiaTheme="minorAscii" w:cstheme="minorAscii"/>
             <w:b w:val="0"/>
             <w:bCs w:val="0"/>
             <w:i w:val="0"/>
@@ -2114,7 +2164,7 @@
       </w:hyperlink>
       <w:r>
         <w:rPr>
-          <w:rFonts w:ascii="Aptos Display" w:hAnsi="Aptos Display" w:eastAsia="Aptos Display" w:cs="Aptos Display"/>
+          <w:rFonts w:ascii="Aptos" w:hAnsi="Aptos" w:eastAsia="Aptos" w:cs="Aptos" w:asciiTheme="minorAscii" w:hAnsiTheme="minorAscii" w:eastAsiaTheme="minorAscii" w:cstheme="minorAscii"/>
           <w:b w:val="0"/>
           <w:bCs w:val="0"/>
           <w:i w:val="0"/>
@@ -2131,7 +2181,7 @@
       </w:r>
       <w:r>
         <w:rPr>
-          <w:rFonts w:ascii="Aptos Display" w:hAnsi="Aptos Display" w:eastAsia="Aptos Display" w:cs="Aptos Display"/>
+          <w:rFonts w:ascii="Aptos" w:hAnsi="Aptos" w:eastAsia="Aptos" w:cs="Aptos" w:asciiTheme="minorAscii" w:hAnsiTheme="minorAscii" w:eastAsiaTheme="minorAscii" w:cstheme="minorAscii"/>
           <w:b w:val="0"/>
           <w:bCs w:val="0"/>
           <w:i w:val="0"/>
@@ -2146,11 +2196,11 @@
         </w:rPr>
         <w:t xml:space="preserve"> </w:t>
       </w:r>
-      <w:hyperlink r:id="R9de28746551944f6">
+      <w:hyperlink r:id="R783d431a26f84370">
         <w:r>
           <w:rPr>
             <w:rStyle w:val="Hyperlink"/>
-            <w:rFonts w:ascii="Aptos Display" w:hAnsi="Aptos Display" w:eastAsia="Aptos Display" w:cs="Aptos Display"/>
+            <w:rFonts w:ascii="Aptos" w:hAnsi="Aptos" w:eastAsia="Aptos" w:cs="Aptos" w:asciiTheme="minorAscii" w:hAnsiTheme="minorAscii" w:eastAsiaTheme="minorAscii" w:cstheme="minorAscii"/>
             <w:b w:val="0"/>
             <w:bCs w:val="0"/>
             <w:i w:val="0"/>
@@ -2171,7 +2221,7 @@
       </w:hyperlink>
       <w:r>
         <w:rPr>
-          <w:rFonts w:ascii="Aptos Display" w:hAnsi="Aptos Display" w:eastAsia="Aptos Display" w:cs="Aptos Display"/>
+          <w:rFonts w:ascii="Aptos" w:hAnsi="Aptos" w:eastAsia="Aptos" w:cs="Aptos" w:asciiTheme="minorAscii" w:hAnsiTheme="minorAscii" w:eastAsiaTheme="minorAscii" w:cstheme="minorAscii"/>
           <w:b w:val="0"/>
           <w:bCs w:val="0"/>
           <w:i w:val="0"/>
@@ -2188,7 +2238,7 @@
       </w:r>
       <w:r>
         <w:rPr>
-          <w:rFonts w:ascii="Aptos Display" w:hAnsi="Aptos Display" w:eastAsia="Aptos Display" w:cs="Aptos Display"/>
+          <w:rFonts w:ascii="Aptos" w:hAnsi="Aptos" w:eastAsia="Aptos" w:cs="Aptos" w:asciiTheme="minorAscii" w:hAnsiTheme="minorAscii" w:eastAsiaTheme="minorAscii" w:cstheme="minorAscii"/>
           <w:b w:val="0"/>
           <w:bCs w:val="0"/>
           <w:i w:val="0"/>
@@ -2203,11 +2253,11 @@
         </w:rPr>
         <w:t xml:space="preserve">and </w:t>
       </w:r>
-      <w:hyperlink r:id="Ra0823712cdc14724">
+      <w:hyperlink r:id="R96117a8a3e3643cd">
         <w:r>
           <w:rPr>
             <w:rStyle w:val="Hyperlink"/>
-            <w:rFonts w:ascii="Aptos Display" w:hAnsi="Aptos Display" w:eastAsia="Aptos Display" w:cs="Aptos Display"/>
+            <w:rFonts w:ascii="Aptos" w:hAnsi="Aptos" w:eastAsia="Aptos" w:cs="Aptos" w:asciiTheme="minorAscii" w:hAnsiTheme="minorAscii" w:eastAsiaTheme="minorAscii" w:cstheme="minorAscii"/>
             <w:b w:val="0"/>
             <w:bCs w:val="0"/>
             <w:i w:val="0"/>
@@ -2226,7 +2276,7 @@
       </w:hyperlink>
       <w:r>
         <w:rPr>
-          <w:rFonts w:ascii="Aptos Display" w:hAnsi="Aptos Display" w:eastAsia="Aptos Display" w:cs="Aptos Display"/>
+          <w:rFonts w:ascii="Aptos" w:hAnsi="Aptos" w:eastAsia="Aptos" w:cs="Aptos" w:asciiTheme="minorAscii" w:hAnsiTheme="minorAscii" w:eastAsiaTheme="minorAscii" w:cstheme="minorAscii"/>
           <w:b w:val="0"/>
           <w:bCs w:val="0"/>
           <w:i w:val="0"/>
@@ -2252,7 +2302,7 @@
         <w:bidi w:val="0"/>
         <w:spacing w:before="80" w:after="80" w:line="240" w:lineRule="auto"/>
         <w:rPr>
-          <w:rFonts w:ascii="Aptos Display" w:hAnsi="Aptos Display" w:eastAsia="Aptos Display" w:cs="Aptos Display"/>
+          <w:rFonts w:ascii="Aptos" w:hAnsi="Aptos" w:eastAsia="Aptos" w:cs="Aptos" w:asciiTheme="minorAscii" w:hAnsiTheme="minorAscii" w:eastAsiaTheme="minorAscii" w:cstheme="minorAscii"/>
           <w:b w:val="0"/>
           <w:bCs w:val="0"/>
           <w:i w:val="0"/>
@@ -2268,7 +2318,7 @@
       </w:pPr>
       <w:r>
         <w:rPr>
-          <w:rFonts w:ascii="Aptos Display" w:hAnsi="Aptos Display" w:eastAsia="Aptos Display" w:cs="Aptos Display"/>
+          <w:rFonts w:ascii="Aptos" w:hAnsi="Aptos" w:eastAsia="Aptos" w:cs="Aptos" w:asciiTheme="minorAscii" w:hAnsiTheme="minorAscii" w:eastAsiaTheme="minorAscii" w:cstheme="minorAscii"/>
           <w:b w:val="0"/>
           <w:bCs w:val="0"/>
           <w:i w:val="0"/>
@@ -2285,7 +2335,7 @@
       </w:r>
       <w:r>
         <w:rPr>
-          <w:rFonts w:ascii="Aptos Display" w:hAnsi="Aptos Display" w:eastAsia="Aptos Display" w:cs="Aptos Display"/>
+          <w:rFonts w:ascii="Aptos" w:hAnsi="Aptos" w:eastAsia="Aptos" w:cs="Aptos" w:asciiTheme="minorAscii" w:hAnsiTheme="minorAscii" w:eastAsiaTheme="minorAscii" w:cstheme="minorAscii"/>
           <w:b w:val="0"/>
           <w:bCs w:val="0"/>
           <w:i w:val="0"/>
@@ -2302,7 +2352,7 @@
       </w:r>
       <w:r>
         <w:rPr>
-          <w:rFonts w:ascii="Aptos Display" w:hAnsi="Aptos Display" w:eastAsia="Aptos Display" w:cs="Aptos Display"/>
+          <w:rFonts w:ascii="Aptos" w:hAnsi="Aptos" w:eastAsia="Aptos" w:cs="Aptos" w:asciiTheme="minorAscii" w:hAnsiTheme="minorAscii" w:eastAsiaTheme="minorAscii" w:cstheme="minorAscii"/>
           <w:b w:val="0"/>
           <w:bCs w:val="0"/>
           <w:i w:val="0"/>
@@ -2319,7 +2369,7 @@
       </w:r>
       <w:r>
         <w:rPr>
-          <w:rFonts w:ascii="Aptos Display" w:hAnsi="Aptos Display" w:eastAsia="Aptos Display" w:cs="Aptos Display"/>
+          <w:rFonts w:ascii="Aptos" w:hAnsi="Aptos" w:eastAsia="Aptos" w:cs="Aptos" w:asciiTheme="minorAscii" w:hAnsiTheme="minorAscii" w:eastAsiaTheme="minorAscii" w:cstheme="minorAscii"/>
           <w:b w:val="0"/>
           <w:bCs w:val="0"/>
           <w:i w:val="0"/>
@@ -2333,7 +2383,7 @@
       </w:r>
       <w:r>
         <w:rPr>
-          <w:rFonts w:ascii="Aptos Display" w:hAnsi="Aptos Display" w:eastAsia="Aptos Display" w:cs="Aptos Display"/>
+          <w:rFonts w:ascii="Aptos" w:hAnsi="Aptos" w:eastAsia="Aptos" w:cs="Aptos" w:asciiTheme="minorAscii" w:hAnsiTheme="minorAscii" w:eastAsiaTheme="minorAscii" w:cstheme="minorAscii"/>
           <w:b w:val="0"/>
           <w:bCs w:val="0"/>
           <w:i w:val="0"/>
@@ -2359,7 +2409,7 @@
         <w:bidi w:val="0"/>
         <w:spacing w:before="80" w:after="80" w:line="240" w:lineRule="auto"/>
         <w:rPr>
-          <w:rFonts w:ascii="Aptos Display" w:hAnsi="Aptos Display" w:eastAsia="Aptos Display" w:cs="Aptos Display"/>
+          <w:rFonts w:ascii="Aptos" w:hAnsi="Aptos" w:eastAsia="Aptos" w:cs="Aptos" w:asciiTheme="minorAscii" w:hAnsiTheme="minorAscii" w:eastAsiaTheme="minorAscii" w:cstheme="minorAscii"/>
           <w:b w:val="0"/>
           <w:bCs w:val="0"/>
           <w:i w:val="0"/>
@@ -2375,7 +2425,7 @@
       </w:pPr>
       <w:r>
         <w:rPr>
-          <w:rFonts w:ascii="Aptos Display" w:hAnsi="Aptos Display" w:eastAsia="Aptos Display" w:cs="Aptos Display"/>
+          <w:rFonts w:ascii="Aptos" w:hAnsi="Aptos" w:eastAsia="Aptos" w:cs="Aptos" w:asciiTheme="minorAscii" w:hAnsiTheme="minorAscii" w:eastAsiaTheme="minorAscii" w:cstheme="minorAscii"/>
           <w:b w:val="0"/>
           <w:bCs w:val="0"/>
           <w:i w:val="0"/>
@@ -2390,11 +2440,11 @@
         </w:rPr>
         <w:t xml:space="preserve">If you need additional assistance, you can ask your personal tutor, student engagement officer </w:t>
       </w:r>
-      <w:hyperlink r:id="R1feac2b7eaca4785">
+      <w:hyperlink r:id="R28765dd42bbb49f9">
         <w:r>
           <w:rPr>
             <w:rStyle w:val="Hyperlink"/>
-            <w:rFonts w:ascii="Aptos Display" w:hAnsi="Aptos Display" w:eastAsia="Aptos Display" w:cs="Aptos Display"/>
+            <w:rFonts w:ascii="Aptos" w:hAnsi="Aptos" w:eastAsia="Aptos" w:cs="Aptos" w:asciiTheme="minorAscii" w:hAnsiTheme="minorAscii" w:eastAsiaTheme="minorAscii" w:cstheme="minorAscii"/>
             <w:b w:val="0"/>
             <w:bCs w:val="0"/>
             <w:i w:val="0"/>
@@ -2415,7 +2465,7 @@
       </w:hyperlink>
       <w:r>
         <w:rPr>
-          <w:rFonts w:ascii="Aptos Display" w:hAnsi="Aptos Display" w:eastAsia="Aptos Display" w:cs="Aptos Display"/>
+          <w:rFonts w:ascii="Aptos" w:hAnsi="Aptos" w:eastAsia="Aptos" w:cs="Aptos" w:asciiTheme="minorAscii" w:hAnsiTheme="minorAscii" w:eastAsiaTheme="minorAscii" w:cstheme="minorAscii"/>
           <w:b w:val="0"/>
           <w:bCs w:val="0"/>
           <w:i w:val="0"/>
@@ -2432,7 +2482,7 @@
       </w:r>
       <w:r>
         <w:rPr>
-          <w:rFonts w:ascii="Aptos Display" w:hAnsi="Aptos Display" w:eastAsia="Aptos Display" w:cs="Aptos Display"/>
+          <w:rFonts w:ascii="Aptos" w:hAnsi="Aptos" w:eastAsia="Aptos" w:cs="Aptos" w:asciiTheme="minorAscii" w:hAnsiTheme="minorAscii" w:eastAsiaTheme="minorAscii" w:cstheme="minorAscii"/>
           <w:b w:val="0"/>
           <w:bCs w:val="0"/>
           <w:i w:val="0"/>
@@ -2458,7 +2508,7 @@
         <w:bidi w:val="0"/>
         <w:spacing w:before="80" w:after="80" w:line="240" w:lineRule="auto"/>
         <w:rPr>
-          <w:rFonts w:ascii="Aptos Display" w:hAnsi="Aptos Display" w:eastAsia="Aptos Display" w:cs="Aptos Display"/>
+          <w:rFonts w:ascii="Aptos" w:hAnsi="Aptos" w:eastAsia="Aptos" w:cs="Aptos" w:asciiTheme="minorAscii" w:hAnsiTheme="minorAscii" w:eastAsiaTheme="minorAscii" w:cstheme="minorAscii"/>
           <w:b w:val="0"/>
           <w:bCs w:val="0"/>
           <w:i w:val="0"/>
@@ -2474,7 +2524,7 @@
       </w:pPr>
       <w:r>
         <w:rPr>
-          <w:rFonts w:ascii="Aptos Display" w:hAnsi="Aptos Display" w:eastAsia="Aptos Display" w:cs="Aptos Display"/>
+          <w:rFonts w:ascii="Aptos" w:hAnsi="Aptos" w:eastAsia="Aptos" w:cs="Aptos" w:asciiTheme="minorAscii" w:hAnsiTheme="minorAscii" w:eastAsiaTheme="minorAscii" w:cstheme="minorAscii"/>
           <w:b w:val="0"/>
           <w:bCs w:val="0"/>
           <w:i w:val="0"/>
@@ -2489,11 +2539,11 @@
         </w:rPr>
         <w:t xml:space="preserve">If you are concerned about your well-being, contact our </w:t>
       </w:r>
-      <w:hyperlink r:id="Rf76bec4c88ea4740">
+      <w:hyperlink r:id="R07942f27cff749ed">
         <w:r>
           <w:rPr>
             <w:rStyle w:val="Hyperlink"/>
-            <w:rFonts w:ascii="Aptos Display" w:hAnsi="Aptos Display" w:eastAsia="Aptos Display" w:cs="Aptos Display"/>
+            <w:rFonts w:ascii="Aptos" w:hAnsi="Aptos" w:eastAsia="Aptos" w:cs="Aptos" w:asciiTheme="minorAscii" w:hAnsiTheme="minorAscii" w:eastAsiaTheme="minorAscii" w:cstheme="minorAscii"/>
             <w:b w:val="0"/>
             <w:bCs w:val="0"/>
             <w:i w:val="0"/>
@@ -2812,8 +2862,9 @@
         <w:t xml:space="preserve"> before continuing.</w:t>
       </w:r>
     </w:p>
-    <w:p xmlns:wp14="http://schemas.microsoft.com/office/word/2010/wordml" wp14:paraId="2C179F31" wp14:textId="3068AB38">
-      <w:pPr>
+    <w:p xmlns:wp14="http://schemas.microsoft.com/office/word/2010/wordml" wp14:paraId="2C179F31" wp14:textId="0983BEFC">
+      <w:pPr>
+        <w:pStyle w:val="Normal"/>
         <w:bidi w:val="0"/>
         <w:spacing w:before="180" w:beforeAutospacing="off" w:after="180" w:afterAutospacing="off"/>
       </w:pPr>
@@ -2825,14 +2876,54 @@
           <w:szCs w:val="24"/>
           <w:lang w:val="en-US"/>
         </w:rPr>
-        <w:t xml:space="preserve">You also need to be able to edit and run a Flutter project in your environment of choice, and to commit your changes to a GitHub repository. Both of these are explained in </w:t>
-      </w:r>
-      <w:hyperlink r:id="R974f1d02fcf04802">
+        <w:t xml:space="preserve">You also need to be able to edit and run a Flutter project in your environment of </w:t>
+      </w:r>
+      <w:r>
+        <w:rPr>
+          <w:rFonts w:ascii="Aptos" w:hAnsi="Aptos" w:eastAsia="Aptos" w:cs="Aptos"/>
+          <w:noProof w:val="0"/>
+          <w:sz w:val="24"/>
+          <w:szCs w:val="24"/>
+          <w:lang w:val="en-US"/>
+        </w:rPr>
+        <w:t>choice and</w:t>
+      </w:r>
+      <w:r>
+        <w:rPr>
+          <w:rFonts w:ascii="Aptos" w:hAnsi="Aptos" w:eastAsia="Aptos" w:cs="Aptos"/>
+          <w:noProof w:val="0"/>
+          <w:sz w:val="24"/>
+          <w:szCs w:val="24"/>
+          <w:lang w:val="en-US"/>
+        </w:rPr>
+        <w:t xml:space="preserve"> to commit your changes to a GitHub repository. </w:t>
+      </w:r>
+      <w:r>
+        <w:rPr>
+          <w:rFonts w:ascii="Aptos" w:hAnsi="Aptos" w:eastAsia="Aptos" w:cs="Aptos"/>
+          <w:noProof w:val="0"/>
+          <w:sz w:val="24"/>
+          <w:szCs w:val="24"/>
+          <w:lang w:val="en-US"/>
+        </w:rPr>
+        <w:t>Both of these</w:t>
+      </w:r>
+      <w:r>
+        <w:rPr>
+          <w:rFonts w:ascii="Aptos" w:hAnsi="Aptos" w:eastAsia="Aptos" w:cs="Aptos"/>
+          <w:noProof w:val="0"/>
+          <w:sz w:val="24"/>
+          <w:szCs w:val="24"/>
+          <w:lang w:val="en-US"/>
+        </w:rPr>
+        <w:t xml:space="preserve"> are explained in </w:t>
+      </w:r>
+      <w:hyperlink r:id="Rca6f78436bbd469d">
         <w:r>
           <w:rPr>
             <w:rStyle w:val="Hyperlink"/>
             <w:noProof w:val="0"/>
-            <w:color w:val="156082" w:themeColor="accent1" w:themeTint="FF" w:themeShade="FF"/>
+            <w:color w:val="155F81"/>
             <w:lang w:val="en-US"/>
           </w:rPr>
           <w:t>Worksheet 1</w:t>
@@ -3660,10 +3751,11 @@
         </w:rPr>
         <w:t xml:space="preserve"> clone </w:t>
       </w:r>
-      <w:hyperlink r:id="R7d8a2c8342134617">
+      <w:hyperlink r:id="R0c2ab1e2d0c54342">
         <w:r>
           <w:rPr>
             <w:rStyle w:val="Hyperlink"/>
+            <w:rFonts w:ascii="Consolas" w:hAnsi="Consolas" w:eastAsia="Consolas" w:cs="Consolas"/>
             <w:noProof w:val="0"/>
             <w:color w:val="auto"/>
             <w:lang w:val="en-US"/>
@@ -5591,8 +5683,9 @@
         <w:t xml:space="preserve"> └── README.md                   # This file</w:t>
       </w:r>
     </w:p>
-    <w:p xmlns:wp14="http://schemas.microsoft.com/office/word/2010/wordml" wp14:paraId="732C61F2" wp14:textId="7638B9CD">
-      <w:pPr>
+    <w:p xmlns:wp14="http://schemas.microsoft.com/office/word/2010/wordml" wp14:paraId="732C61F2" wp14:textId="0D0AA568">
+      <w:pPr>
+        <w:pStyle w:val="Normal"/>
         <w:bidi w:val="0"/>
         <w:spacing w:before="180" w:beforeAutospacing="off" w:after="180" w:afterAutospacing="off"/>
       </w:pPr>
@@ -5604,7 +5697,67 @@
           <w:szCs w:val="24"/>
           <w:lang w:val="en-US"/>
         </w:rPr>
-        <w:t>Note that this is the initial structure. You are expected to create additional files and directories as needed to complete the coursework, and you can reorganize the project structure as you see fit.</w:t>
+        <w:t xml:space="preserve">Note that this is the </w:t>
+      </w:r>
+      <w:r>
+        <w:rPr>
+          <w:rFonts w:ascii="Aptos" w:hAnsi="Aptos" w:eastAsia="Aptos" w:cs="Aptos"/>
+          <w:noProof w:val="0"/>
+          <w:sz w:val="24"/>
+          <w:szCs w:val="24"/>
+          <w:lang w:val="en-US"/>
+        </w:rPr>
+        <w:t>initial</w:t>
+      </w:r>
+      <w:r>
+        <w:rPr>
+          <w:rFonts w:ascii="Aptos" w:hAnsi="Aptos" w:eastAsia="Aptos" w:cs="Aptos"/>
+          <w:noProof w:val="0"/>
+          <w:sz w:val="24"/>
+          <w:szCs w:val="24"/>
+          <w:lang w:val="en-US"/>
+        </w:rPr>
+        <w:t xml:space="preserve"> structure. You are expected to create </w:t>
+      </w:r>
+      <w:r>
+        <w:rPr>
+          <w:rFonts w:ascii="Aptos" w:hAnsi="Aptos" w:eastAsia="Aptos" w:cs="Aptos"/>
+          <w:noProof w:val="0"/>
+          <w:sz w:val="24"/>
+          <w:szCs w:val="24"/>
+          <w:lang w:val="en-US"/>
+        </w:rPr>
+        <w:t>additional</w:t>
+      </w:r>
+      <w:r>
+        <w:rPr>
+          <w:rFonts w:ascii="Aptos" w:hAnsi="Aptos" w:eastAsia="Aptos" w:cs="Aptos"/>
+          <w:noProof w:val="0"/>
+          <w:sz w:val="24"/>
+          <w:szCs w:val="24"/>
+          <w:lang w:val="en-US"/>
+        </w:rPr>
+        <w:t xml:space="preserve"> files and directories as needed to complete the coursework, and you can </w:t>
+      </w:r>
+      <w:r>
+        <w:rPr>
+          <w:rFonts w:ascii="Aptos" w:hAnsi="Aptos" w:eastAsia="Aptos" w:cs="Aptos"/>
+          <w:noProof w:val="0"/>
+          <w:sz w:val="24"/>
+          <w:szCs w:val="24"/>
+          <w:lang w:val="en-US"/>
+        </w:rPr>
+        <w:t>reorganise</w:t>
+      </w:r>
+      <w:r>
+        <w:rPr>
+          <w:rFonts w:ascii="Aptos" w:hAnsi="Aptos" w:eastAsia="Aptos" w:cs="Aptos"/>
+          <w:noProof w:val="0"/>
+          <w:sz w:val="24"/>
+          <w:szCs w:val="24"/>
+          <w:lang w:val="en-US"/>
+        </w:rPr>
+        <w:t xml:space="preserve"> the project structure as you see fit.</w:t>
       </w:r>
     </w:p>
     <w:p xmlns:wp14="http://schemas.microsoft.com/office/word/2010/wordml" wp14:paraId="004808F9" wp14:textId="26D66885">
@@ -5700,8 +5853,9 @@
         <w:t>Extenuating Circumstances</w:t>
       </w:r>
     </w:p>
-    <w:p xmlns:wp14="http://schemas.microsoft.com/office/word/2010/wordml" wp14:paraId="508EC0DD" wp14:textId="1842C87B">
-      <w:pPr>
+    <w:p xmlns:wp14="http://schemas.microsoft.com/office/word/2010/wordml" wp14:paraId="508EC0DD" wp14:textId="40ABAC18">
+      <w:pPr>
+        <w:pStyle w:val="Normal"/>
         <w:bidi w:val="0"/>
         <w:spacing w:before="180" w:beforeAutospacing="off" w:after="180" w:afterAutospacing="off"/>
       </w:pPr>
@@ -5723,7 +5877,27 @@
           <w:szCs w:val="24"/>
           <w:lang w:val="en-US"/>
         </w:rPr>
-        <w:t xml:space="preserve"> (for example mental or physical illness or problems with </w:t>
+        <w:t xml:space="preserve"> (for </w:t>
+      </w:r>
+      <w:r>
+        <w:rPr>
+          <w:rFonts w:ascii="Aptos" w:hAnsi="Aptos" w:eastAsia="Aptos" w:cs="Aptos"/>
+          <w:noProof w:val="0"/>
+          <w:sz w:val="24"/>
+          <w:szCs w:val="24"/>
+          <w:lang w:val="en-US"/>
+        </w:rPr>
+        <w:t>example,</w:t>
+      </w:r>
+      <w:r>
+        <w:rPr>
+          <w:rFonts w:ascii="Aptos" w:hAnsi="Aptos" w:eastAsia="Aptos" w:cs="Aptos"/>
+          <w:noProof w:val="0"/>
+          <w:sz w:val="24"/>
+          <w:szCs w:val="24"/>
+          <w:lang w:val="en-US"/>
+        </w:rPr>
+        <w:t xml:space="preserve"> mental or physical illness or problems with </w:t>
       </w:r>
       <w:r>
         <w:rPr>
@@ -5775,15 +5949,33 @@
         </w:rPr>
         <w:t xml:space="preserve"> an </w:t>
       </w:r>
-      <w:hyperlink r:id="R308dad9d30f348d5">
+      <w:hyperlink r:id="R267f0f7b0ed547d4">
         <w:r>
           <w:rPr>
             <w:rStyle w:val="Hyperlink"/>
             <w:noProof w:val="0"/>
-            <w:color w:val="156082" w:themeColor="accent1" w:themeTint="FF" w:themeShade="FF"/>
+            <w:color w:val="155F81"/>
             <w:lang w:val="en-US"/>
           </w:rPr>
-          <w:t>Extenuating Circumstances Form (ECF)</w:t>
+          <w:t>Extenuating Circumstances Form (</w:t>
+        </w:r>
+        <w:r>
+          <w:rPr>
+            <w:rStyle w:val="Hyperlink"/>
+            <w:noProof w:val="0"/>
+            <w:color w:val="155F81"/>
+            <w:lang w:val="en-US"/>
+          </w:rPr>
+          <w:t>ECF</w:t>
+        </w:r>
+        <w:r>
+          <w:rPr>
+            <w:rStyle w:val="Hyperlink"/>
+            <w:noProof w:val="0"/>
+            <w:color w:val="155F81"/>
+            <w:lang w:val="en-US"/>
+          </w:rPr>
+          <w:t>)</w:t>
         </w:r>
       </w:hyperlink>
       <w:r>
@@ -5887,8 +6079,9 @@
         <w:t>Note that ECFs apply to the whole of Item 1 (the entire Flutter Coursework, 50% of the module). You cannot use an ECF just for individual demos.</w:t>
       </w:r>
     </w:p>
-    <w:p xmlns:wp14="http://schemas.microsoft.com/office/word/2010/wordml" wp14:paraId="2F498F89" wp14:textId="4697D2F0">
-      <w:pPr>
+    <w:p xmlns:wp14="http://schemas.microsoft.com/office/word/2010/wordml" wp14:paraId="2F498F89" wp14:textId="379CC765">
+      <w:pPr>
+        <w:pStyle w:val="Normal"/>
         <w:bidi w:val="0"/>
         <w:spacing w:before="180" w:beforeAutospacing="off" w:after="180" w:afterAutospacing="off"/>
       </w:pPr>
@@ -5900,7 +6093,57 @@
           <w:szCs w:val="24"/>
           <w:lang w:val="en-US"/>
         </w:rPr>
-        <w:t xml:space="preserve">If you have an approved ECF, your Item 1 mark is recorded as 0 for the demo portfolio and you are instead expected to take the deferral assessment in July; your Item 1 mark then comes from that deferral coursework alone (not from the demos). </w:t>
+        <w:t xml:space="preserve">If you have an approved </w:t>
+      </w:r>
+      <w:r>
+        <w:rPr>
+          <w:rFonts w:ascii="Aptos" w:hAnsi="Aptos" w:eastAsia="Aptos" w:cs="Aptos"/>
+          <w:noProof w:val="0"/>
+          <w:sz w:val="24"/>
+          <w:szCs w:val="24"/>
+          <w:lang w:val="en-US"/>
+        </w:rPr>
+        <w:t>ECF</w:t>
+      </w:r>
+      <w:r>
+        <w:rPr>
+          <w:rFonts w:ascii="Aptos" w:hAnsi="Aptos" w:eastAsia="Aptos" w:cs="Aptos"/>
+          <w:noProof w:val="0"/>
+          <w:sz w:val="24"/>
+          <w:szCs w:val="24"/>
+          <w:lang w:val="en-US"/>
+        </w:rPr>
+        <w:t xml:space="preserve">, your Item 1 mark is recorded as 0 for the demo </w:t>
+      </w:r>
+      <w:r>
+        <w:rPr>
+          <w:rFonts w:ascii="Aptos" w:hAnsi="Aptos" w:eastAsia="Aptos" w:cs="Aptos"/>
+          <w:noProof w:val="0"/>
+          <w:sz w:val="24"/>
+          <w:szCs w:val="24"/>
+          <w:lang w:val="en-US"/>
+        </w:rPr>
+        <w:t>portfolio,</w:t>
+      </w:r>
+      <w:r>
+        <w:rPr>
+          <w:rFonts w:ascii="Aptos" w:hAnsi="Aptos" w:eastAsia="Aptos" w:cs="Aptos"/>
+          <w:noProof w:val="0"/>
+          <w:sz w:val="24"/>
+          <w:szCs w:val="24"/>
+          <w:lang w:val="en-US"/>
+        </w:rPr>
+        <w:t xml:space="preserve"> and you are instead expected to take the deferral assessment in the week beginning Monday 22 February 2027;</w:t>
+      </w:r>
+      <w:r>
+        <w:rPr>
+          <w:rFonts w:ascii="Aptos" w:hAnsi="Aptos" w:eastAsia="Aptos" w:cs="Aptos"/>
+          <w:noProof w:val="0"/>
+          <w:sz w:val="24"/>
+          <w:szCs w:val="24"/>
+          <w:lang w:val="en-US"/>
+        </w:rPr>
+        <w:t xml:space="preserve"> your Item 1 mark then comes from that deferral coursework alone (not from the demos). </w:t>
       </w:r>
     </w:p>
     <w:p xmlns:wp14="http://schemas.microsoft.com/office/word/2010/wordml" wp14:paraId="6A1E7358" wp14:textId="30DC1B9F">

</xml_diff>

<commit_message>
docs(setup): remove cloud development alternatives
</commit_message>
<xml_diff>
--- a/southsea_cinema_coursework_brief.docx
+++ b/southsea_cinema_coursework_brief.docx
@@ -15,7 +15,7 @@
       </w:pPr>
       <w:r>
         <w:drawing>
-          <wp:inline xmlns:wp14="http://schemas.microsoft.com/office/word/2010/wordprocessingDrawing" wp14:editId="6B05795C" wp14:anchorId="203E7B52">
+          <wp:inline xmlns:wp14="http://schemas.microsoft.com/office/word/2010/wordprocessingDrawing" wp14:editId="12541964" wp14:anchorId="203E7B52">
             <wp:extent cx="1019175" cy="1181100"/>
             <wp:effectExtent l="0" t="0" r="0" b="0"/>
             <wp:docPr id="1098071563" name="drawing" title="University of Portsmouth Logo"/>
@@ -298,7 +298,7 @@
                 <w:lang w:val="en-US"/>
               </w:rPr>
             </w:pPr>
-            <w:hyperlink r:id="Rb2460dbaf39447ca">
+            <w:hyperlink r:id="R7387c3a1e1ce4e53">
               <w:r>
                 <w:rPr>
                   <w:rStyle w:val="Hyperlink"/>
@@ -346,7 +346,7 @@
               </w:rPr>
               <w:t>(</w:t>
             </w:r>
-            <w:hyperlink r:id="R3061ca8ec42d4cfa">
+            <w:hyperlink r:id="Rc9822d12e4064aea">
               <w:r>
                 <w:rPr>
                   <w:rStyle w:val="Hyperlink"/>
@@ -1714,7 +1714,7 @@
         </w:rPr>
         <w:t xml:space="preserve">The </w:t>
       </w:r>
-      <w:hyperlink r:id="R9c17ee1df19f4005">
+      <w:hyperlink r:id="R77b83efda70e42d8">
         <w:r>
           <w:rPr>
             <w:rStyle w:val="Hyperlink"/>
@@ -1799,7 +1799,7 @@
           <w:lang w:val="en-US"/>
         </w:rPr>
       </w:pPr>
-      <w:hyperlink r:id="Rdf8fc2aaeaaa439f">
+      <w:hyperlink r:id="R22df3f9f58aa4072">
         <w:r>
           <w:rPr>
             <w:rStyle w:val="Hyperlink"/>
@@ -1983,7 +1983,7 @@
         </w:rPr>
         <w:t xml:space="preserve">The University takes any form of academic misconduct (such as plagiarism) seriously, so please make sure your work is your own. Please ensure you adhere to our </w:t>
       </w:r>
-      <w:hyperlink r:id="R485e79aad6f24031">
+      <w:hyperlink r:id="R849e97bb6e294be9">
         <w:r>
           <w:rPr>
             <w:rStyle w:val="Hyperlink"/>
@@ -2040,7 +2040,7 @@
         </w:rPr>
         <w:t xml:space="preserve">and watch the video on </w:t>
       </w:r>
-      <w:hyperlink r:id="R1506ea341f3840ef">
+      <w:hyperlink r:id="Rfd2632cc6d214691">
         <w:r>
           <w:rPr>
             <w:rStyle w:val="Hyperlink"/>
@@ -2139,7 +2139,7 @@
         </w:rPr>
         <w:t xml:space="preserve"> format. Detailed advice on referencing is available from the </w:t>
       </w:r>
-      <w:hyperlink r:id="Re88e460808604342">
+      <w:hyperlink r:id="R24c54a2d023a46cc">
         <w:r>
           <w:rPr>
             <w:rStyle w:val="Hyperlink"/>
@@ -2196,7 +2196,7 @@
         </w:rPr>
         <w:t xml:space="preserve"> </w:t>
       </w:r>
-      <w:hyperlink r:id="R783d431a26f84370">
+      <w:hyperlink r:id="Rbc01af331ad84dc4">
         <w:r>
           <w:rPr>
             <w:rStyle w:val="Hyperlink"/>
@@ -2253,7 +2253,7 @@
         </w:rPr>
         <w:t xml:space="preserve">and </w:t>
       </w:r>
-      <w:hyperlink r:id="R96117a8a3e3643cd">
+      <w:hyperlink r:id="Rfb0c950604004c44">
         <w:r>
           <w:rPr>
             <w:rStyle w:val="Hyperlink"/>
@@ -2440,7 +2440,7 @@
         </w:rPr>
         <w:t xml:space="preserve">If you need additional assistance, you can ask your personal tutor, student engagement officer </w:t>
       </w:r>
-      <w:hyperlink r:id="R28765dd42bbb49f9">
+      <w:hyperlink r:id="Ra23558a087f7446f">
         <w:r>
           <w:rPr>
             <w:rStyle w:val="Hyperlink"/>
@@ -2539,7 +2539,7 @@
         </w:rPr>
         <w:t xml:space="preserve">If you are concerned about your well-being, contact our </w:t>
       </w:r>
-      <w:hyperlink r:id="R07942f27cff749ed">
+      <w:hyperlink r:id="R5803a829f37f4a8e">
         <w:r>
           <w:rPr>
             <w:rStyle w:val="Hyperlink"/>
@@ -2785,13 +2785,11 @@
         <w:t xml:space="preserve"> only a basic theme, an empty home page, a small drawer, and a default widget test. You are expected to add screens, widgets, data models, tests, persistence, and cloud services during the coursework.</w:t>
       </w:r>
     </w:p>
-    <w:p xmlns:wp14="http://schemas.microsoft.com/office/word/2010/wordml" wp14:paraId="6AA6BB27" wp14:textId="0F2857D6">
+    <w:p xmlns:wp14="http://schemas.microsoft.com/office/word/2010/wordml" wp14:paraId="7A6B61B3" wp14:textId="4033677E">
       <w:pPr>
         <w:pStyle w:val="Heading2"/>
         <w:bidi w:val="0"/>
         <w:spacing w:before="160" w:beforeAutospacing="off" w:after="80" w:afterAutospacing="off"/>
-      </w:pPr>
-      <w:r>
         <w:rPr>
           <w:rFonts w:ascii="Aptos Display" w:hAnsi="Aptos Display" w:eastAsia="Aptos Display" w:cs="Aptos Display"/>
           <w:b w:val="0"/>
@@ -2802,6 +2800,34 @@
           <w:szCs w:val="32"/>
           <w:lang w:val="en-US"/>
         </w:rPr>
+      </w:pPr>
+    </w:p>
+    <w:p xmlns:wp14="http://schemas.microsoft.com/office/word/2010/wordml" wp14:paraId="6C3EFE9C" wp14:textId="0A70E08E">
+      <w:pPr>
+        <w:bidi w:val="0"/>
+        <w:spacing w:before="160" w:beforeAutospacing="off" w:after="80" w:afterAutospacing="off"/>
+      </w:pPr>
+      <w:r>
+        <w:br w:type="page"/>
+      </w:r>
+    </w:p>
+    <w:p xmlns:wp14="http://schemas.microsoft.com/office/word/2010/wordml" wp14:paraId="6AA6BB27" wp14:textId="541E3442">
+      <w:pPr>
+        <w:pStyle w:val="Heading2"/>
+        <w:bidi w:val="0"/>
+        <w:spacing w:before="160" w:beforeAutospacing="off" w:after="80" w:afterAutospacing="off"/>
+      </w:pPr>
+      <w:r>
+        <w:rPr>
+          <w:rFonts w:ascii="Aptos Display" w:hAnsi="Aptos Display" w:eastAsia="Aptos Display" w:cs="Aptos Display"/>
+          <w:b w:val="0"/>
+          <w:bCs w:val="0"/>
+          <w:noProof w:val="0"/>
+          <w:color w:val="0F4761" w:themeColor="accent1" w:themeTint="FF" w:themeShade="BF"/>
+          <w:sz w:val="32"/>
+          <w:szCs w:val="32"/>
+          <w:lang w:val="en-US"/>
+        </w:rPr>
         <w:t>Getting Started</w:t>
       </w:r>
     </w:p>
@@ -2825,105 +2851,114 @@
         <w:t>Prerequisites</w:t>
       </w:r>
     </w:p>
-    <w:p xmlns:wp14="http://schemas.microsoft.com/office/word/2010/wordml" wp14:paraId="124C22E1" wp14:textId="74D841F7">
-      <w:pPr>
-        <w:bidi w:val="0"/>
-        <w:spacing w:before="180" w:beforeAutospacing="off" w:after="180" w:afterAutospacing="off"/>
-      </w:pPr>
-      <w:r>
-        <w:rPr>
-          <w:rFonts w:ascii="Aptos" w:hAnsi="Aptos" w:eastAsia="Aptos" w:cs="Aptos"/>
-          <w:noProof w:val="0"/>
-          <w:sz w:val="24"/>
-          <w:szCs w:val="24"/>
-          <w:lang w:val="en-US"/>
-        </w:rPr>
-        <w:t xml:space="preserve">You must already have a GitHub account to be able to start this coursework. If you have not done so, read and complete the exercises in </w:t>
-      </w:r>
-      <w:hyperlink r:id="R9dc7eeaf940943e8">
+    <w:p>
+      <w:pPr>
+        <w:pStyle w:val="Normal"/>
+        <w:bidi w:val="0"/>
+      </w:pPr>
+      <w:r>
+        <w:rPr>
+          <w:noProof w:val="0"/>
+          <w:lang w:val="en-US"/>
+        </w:rPr>
+        <w:t>You need:</w:t>
+      </w:r>
+    </w:p>
+    <w:p>
+      <w:pPr>
+        <w:pStyle w:val="ListParagraph"/>
+        <w:numPr>
+          <w:ilvl w:val="0"/>
+          <w:numId w:val="6"/>
+        </w:numPr>
+        <w:bidi w:val="0"/>
+        <w:rPr>
+          <w:noProof w:val="0"/>
+          <w:lang w:val="en-US"/>
+        </w:rPr>
+      </w:pPr>
+      <w:r>
+        <w:rPr>
+          <w:noProof w:val="0"/>
+          <w:lang w:val="en-US"/>
+        </w:rPr>
+        <w:t>A GitHub account</w:t>
+      </w:r>
+    </w:p>
+    <w:p>
+      <w:pPr>
+        <w:pStyle w:val="ListParagraph"/>
+        <w:numPr>
+          <w:ilvl w:val="0"/>
+          <w:numId w:val="6"/>
+        </w:numPr>
+        <w:bidi w:val="0"/>
+        <w:rPr>
+          <w:noProof w:val="0"/>
+          <w:lang w:val="en-US"/>
+        </w:rPr>
+      </w:pPr>
+      <w:r>
+        <w:rPr>
+          <w:noProof w:val="0"/>
+          <w:lang w:val="en-US"/>
+        </w:rPr>
+        <w:t>A way to edit and run Flutter projects</w:t>
+      </w:r>
+    </w:p>
+    <w:p>
+      <w:pPr>
+        <w:pStyle w:val="ListParagraph"/>
+        <w:numPr>
+          <w:ilvl w:val="0"/>
+          <w:numId w:val="6"/>
+        </w:numPr>
+        <w:bidi w:val="0"/>
+        <w:rPr>
+          <w:noProof w:val="0"/>
+          <w:lang w:val="en-US"/>
+        </w:rPr>
+      </w:pPr>
+      <w:r>
+        <w:rPr>
+          <w:noProof w:val="0"/>
+          <w:lang w:val="en-US"/>
+        </w:rPr>
+        <w:t>Git installed and connected to your GitHub account</w:t>
+      </w:r>
+    </w:p>
+    <w:p>
+      <w:pPr>
+        <w:bidi w:val="0"/>
+        <w:rPr>
+          <w:rFonts w:ascii="Aptos" w:hAnsi="Aptos"/>
+          <w:b w:val="0"/>
+          <w:bCs w:val="0"/>
+          <w:noProof w:val="0"/>
+          <w:sz w:val="24"/>
+          <w:szCs w:val="24"/>
+          <w:lang w:val="en-US"/>
+        </w:rPr>
+      </w:pPr>
+      <w:r>
+        <w:rPr>
+          <w:rFonts w:ascii="Aptos" w:hAnsi="Aptos"/>
+          <w:b w:val="0"/>
+          <w:bCs w:val="0"/>
+          <w:noProof w:val="0"/>
+          <w:sz w:val="24"/>
+          <w:szCs w:val="24"/>
+          <w:lang w:val="en-US"/>
+        </w:rPr>
+        <w:t xml:space="preserve">Follow the development environment instructions in </w:t>
+      </w:r>
+      <w:hyperlink r:id="Ra38368581e3a450c">
         <w:r>
           <w:rPr>
             <w:rStyle w:val="Hyperlink"/>
+            <w:b w:val="0"/>
+            <w:bCs w:val="0"/>
             <w:noProof w:val="0"/>
-            <w:color w:val="156082" w:themeColor="accent1" w:themeTint="FF" w:themeShade="FF"/>
-            <w:lang w:val="en-US"/>
-          </w:rPr>
-          <w:t>Worksheet 0</w:t>
-        </w:r>
-      </w:hyperlink>
-      <w:r>
-        <w:rPr>
-          <w:rFonts w:ascii="Aptos" w:hAnsi="Aptos" w:eastAsia="Aptos" w:cs="Aptos"/>
-          <w:noProof w:val="0"/>
-          <w:sz w:val="24"/>
-          <w:szCs w:val="24"/>
-          <w:lang w:val="en-US"/>
-        </w:rPr>
-        <w:t xml:space="preserve"> before continuing.</w:t>
-      </w:r>
-    </w:p>
-    <w:p xmlns:wp14="http://schemas.microsoft.com/office/word/2010/wordml" wp14:paraId="2C179F31" wp14:textId="0983BEFC">
-      <w:pPr>
-        <w:pStyle w:val="Normal"/>
-        <w:bidi w:val="0"/>
-        <w:spacing w:before="180" w:beforeAutospacing="off" w:after="180" w:afterAutospacing="off"/>
-      </w:pPr>
-      <w:r>
-        <w:rPr>
-          <w:rFonts w:ascii="Aptos" w:hAnsi="Aptos" w:eastAsia="Aptos" w:cs="Aptos"/>
-          <w:noProof w:val="0"/>
-          <w:sz w:val="24"/>
-          <w:szCs w:val="24"/>
-          <w:lang w:val="en-US"/>
-        </w:rPr>
-        <w:t xml:space="preserve">You also need to be able to edit and run a Flutter project in your environment of </w:t>
-      </w:r>
-      <w:r>
-        <w:rPr>
-          <w:rFonts w:ascii="Aptos" w:hAnsi="Aptos" w:eastAsia="Aptos" w:cs="Aptos"/>
-          <w:noProof w:val="0"/>
-          <w:sz w:val="24"/>
-          <w:szCs w:val="24"/>
-          <w:lang w:val="en-US"/>
-        </w:rPr>
-        <w:t>choice and</w:t>
-      </w:r>
-      <w:r>
-        <w:rPr>
-          <w:rFonts w:ascii="Aptos" w:hAnsi="Aptos" w:eastAsia="Aptos" w:cs="Aptos"/>
-          <w:noProof w:val="0"/>
-          <w:sz w:val="24"/>
-          <w:szCs w:val="24"/>
-          <w:lang w:val="en-US"/>
-        </w:rPr>
-        <w:t xml:space="preserve"> to commit your changes to a GitHub repository. </w:t>
-      </w:r>
-      <w:r>
-        <w:rPr>
-          <w:rFonts w:ascii="Aptos" w:hAnsi="Aptos" w:eastAsia="Aptos" w:cs="Aptos"/>
-          <w:noProof w:val="0"/>
-          <w:sz w:val="24"/>
-          <w:szCs w:val="24"/>
-          <w:lang w:val="en-US"/>
-        </w:rPr>
-        <w:t>Both of these</w:t>
-      </w:r>
-      <w:r>
-        <w:rPr>
-          <w:rFonts w:ascii="Aptos" w:hAnsi="Aptos" w:eastAsia="Aptos" w:cs="Aptos"/>
-          <w:noProof w:val="0"/>
-          <w:sz w:val="24"/>
-          <w:szCs w:val="24"/>
-          <w:lang w:val="en-US"/>
-        </w:rPr>
-        <w:t xml:space="preserve"> are explained in </w:t>
-      </w:r>
-      <w:hyperlink r:id="Rca6f78436bbd469d">
-        <w:r>
-          <w:rPr>
-            <w:rStyle w:val="Hyperlink"/>
-            <w:noProof w:val="0"/>
-            <w:color w:val="155F81"/>
             <w:lang w:val="en-US"/>
           </w:rPr>
           <w:t>Worksheet 1</w:t>
@@ -2931,179 +2966,15 @@
       </w:hyperlink>
       <w:r>
         <w:rPr>
-          <w:rFonts w:ascii="Aptos" w:hAnsi="Aptos" w:eastAsia="Aptos" w:cs="Aptos"/>
-          <w:noProof w:val="0"/>
-          <w:sz w:val="24"/>
-          <w:szCs w:val="24"/>
-          <w:lang w:val="en-US"/>
-        </w:rPr>
-        <w:t>; complete it before continuing if you have not done so already.</w:t>
-      </w:r>
-    </w:p>
-    <w:p xmlns:wp14="http://schemas.microsoft.com/office/word/2010/wordml" wp14:paraId="25DDE427" wp14:textId="48A4455E">
-      <w:pPr>
-        <w:bidi w:val="0"/>
-        <w:spacing w:before="180" w:beforeAutospacing="off" w:after="180" w:afterAutospacing="off"/>
-      </w:pPr>
-      <w:r>
-        <w:rPr>
-          <w:rFonts w:ascii="Aptos" w:hAnsi="Aptos" w:eastAsia="Aptos" w:cs="Aptos"/>
-          <w:noProof w:val="0"/>
-          <w:sz w:val="24"/>
-          <w:szCs w:val="24"/>
-          <w:lang w:val="en-US"/>
-        </w:rPr>
-        <w:t>You have three development options:</w:t>
-      </w:r>
-    </w:p>
-    <w:p xmlns:wp14="http://schemas.microsoft.com/office/word/2010/wordml" wp14:paraId="7F51B10F" wp14:textId="28B3EB05">
-      <w:pPr>
-        <w:pStyle w:val="ListParagraph"/>
-        <w:numPr>
-          <w:ilvl w:val="0"/>
-          <w:numId w:val="4"/>
-        </w:numPr>
-        <w:bidi w:val="0"/>
-        <w:spacing w:before="0" w:beforeAutospacing="off" w:after="0" w:afterAutospacing="off"/>
-        <w:ind w:left="720" w:right="0" w:hanging="360"/>
-        <w:rPr>
-          <w:rFonts w:ascii="Aptos" w:hAnsi="Aptos" w:eastAsia="Aptos" w:cs="Aptos"/>
-          <w:noProof w:val="0"/>
-          <w:sz w:val="24"/>
-          <w:szCs w:val="24"/>
-          <w:lang w:val="en-US"/>
-        </w:rPr>
-      </w:pPr>
-      <w:r>
-        <w:rPr>
-          <w:rFonts w:ascii="Aptos" w:hAnsi="Aptos" w:eastAsia="Aptos" w:cs="Aptos"/>
-          <w:noProof w:val="0"/>
-          <w:sz w:val="24"/>
-          <w:szCs w:val="24"/>
-          <w:lang w:val="en-US"/>
-        </w:rPr>
-        <w:t>GitHub Codespaces (browser-based, no local install required)</w:t>
-      </w:r>
-    </w:p>
-    <w:p xmlns:wp14="http://schemas.microsoft.com/office/word/2010/wordml" wp14:paraId="5F729C00" wp14:textId="457DCC82">
-      <w:pPr>
-        <w:pStyle w:val="ListParagraph"/>
-        <w:numPr>
-          <w:ilvl w:val="0"/>
-          <w:numId w:val="4"/>
-        </w:numPr>
-        <w:bidi w:val="0"/>
-        <w:spacing w:before="0" w:beforeAutospacing="off" w:after="0" w:afterAutospacing="off"/>
-        <w:ind w:left="720" w:right="0" w:hanging="360"/>
-        <w:rPr>
-          <w:rFonts w:ascii="Aptos" w:hAnsi="Aptos" w:eastAsia="Aptos" w:cs="Aptos"/>
-          <w:noProof w:val="0"/>
-          <w:sz w:val="24"/>
-          <w:szCs w:val="24"/>
-          <w:lang w:val="en-US"/>
-        </w:rPr>
-      </w:pPr>
-      <w:r>
-        <w:rPr>
-          <w:rFonts w:ascii="Aptos" w:hAnsi="Aptos" w:eastAsia="Aptos" w:cs="Aptos"/>
-          <w:noProof w:val="0"/>
-          <w:sz w:val="24"/>
-          <w:szCs w:val="24"/>
-          <w:lang w:val="en-US"/>
-        </w:rPr>
-        <w:t>University Windows computers</w:t>
-      </w:r>
-    </w:p>
-    <w:p xmlns:wp14="http://schemas.microsoft.com/office/word/2010/wordml" wp14:paraId="32A382DE" wp14:textId="072089B9">
-      <w:pPr>
-        <w:pStyle w:val="ListParagraph"/>
-        <w:numPr>
-          <w:ilvl w:val="0"/>
-          <w:numId w:val="4"/>
-        </w:numPr>
-        <w:bidi w:val="0"/>
-        <w:spacing w:before="0" w:beforeAutospacing="off" w:after="0" w:afterAutospacing="off"/>
-        <w:ind w:left="720" w:right="0" w:hanging="360"/>
-        <w:rPr>
-          <w:rFonts w:ascii="Aptos" w:hAnsi="Aptos" w:eastAsia="Aptos" w:cs="Aptos"/>
-          <w:noProof w:val="0"/>
-          <w:sz w:val="24"/>
-          <w:szCs w:val="24"/>
-          <w:lang w:val="en-US"/>
-        </w:rPr>
-      </w:pPr>
-      <w:r>
-        <w:rPr>
-          <w:rFonts w:ascii="Aptos" w:hAnsi="Aptos" w:eastAsia="Aptos" w:cs="Aptos"/>
-          <w:noProof w:val="0"/>
-          <w:sz w:val="24"/>
-          <w:szCs w:val="24"/>
-          <w:lang w:val="en-US"/>
-        </w:rPr>
-        <w:t>Your own computer</w:t>
-      </w:r>
-    </w:p>
-    <w:p xmlns:wp14="http://schemas.microsoft.com/office/word/2010/wordml" wp14:paraId="142313D8" wp14:textId="6BD35625">
-      <w:pPr>
-        <w:bidi w:val="0"/>
-        <w:spacing w:before="180" w:beforeAutospacing="off" w:after="180" w:afterAutospacing="off"/>
-        <w:rPr>
-          <w:rFonts w:ascii="Aptos" w:hAnsi="Aptos" w:eastAsia="Aptos" w:cs="Aptos"/>
-          <w:noProof w:val="0"/>
-          <w:sz w:val="24"/>
-          <w:szCs w:val="24"/>
-          <w:lang w:val="en-US"/>
-        </w:rPr>
-      </w:pPr>
-      <w:r>
-        <w:rPr>
-          <w:rFonts w:ascii="Aptos" w:hAnsi="Aptos" w:eastAsia="Aptos" w:cs="Aptos"/>
-          <w:noProof w:val="0"/>
-          <w:sz w:val="24"/>
-          <w:szCs w:val="24"/>
-          <w:lang w:val="en-US"/>
-        </w:rPr>
-        <w:t>Note that all the recommended development tools for this coursework</w:t>
-      </w:r>
-      <w:r>
-        <w:rPr>
-          <w:rFonts w:ascii="Aptos" w:hAnsi="Aptos" w:eastAsia="Aptos" w:cs="Aptos"/>
-          <w:noProof w:val="0"/>
-          <w:sz w:val="24"/>
-          <w:szCs w:val="24"/>
-          <w:lang w:val="en-US"/>
-        </w:rPr>
-        <w:t xml:space="preserve"> </w:t>
-      </w:r>
-      <w:r>
-        <w:rPr>
-          <w:rFonts w:ascii="Aptos" w:hAnsi="Aptos" w:eastAsia="Aptos" w:cs="Aptos"/>
-          <w:noProof w:val="0"/>
-          <w:sz w:val="24"/>
-          <w:szCs w:val="24"/>
-          <w:lang w:val="en-US"/>
-        </w:rPr>
-        <w:t xml:space="preserve">are free. If you do not own a high-spec computer, you can use the university machines or a browser-based </w:t>
-      </w:r>
-      <w:r>
-        <w:rPr>
-          <w:rFonts w:ascii="Aptos" w:hAnsi="Aptos" w:eastAsia="Aptos" w:cs="Aptos"/>
-          <w:noProof w:val="0"/>
-          <w:sz w:val="24"/>
-          <w:szCs w:val="24"/>
-          <w:lang w:val="en-US"/>
-        </w:rPr>
-        <w:t>option</w:t>
-      </w:r>
-      <w:r>
-        <w:rPr>
-          <w:rFonts w:ascii="Aptos" w:hAnsi="Aptos" w:eastAsia="Aptos" w:cs="Aptos"/>
-          <w:noProof w:val="0"/>
-          <w:sz w:val="24"/>
-          <w:szCs w:val="24"/>
-          <w:lang w:val="en-US"/>
-        </w:rPr>
-        <w:t>.</w:t>
+          <w:rFonts w:ascii="Aptos" w:hAnsi="Aptos"/>
+          <w:b w:val="0"/>
+          <w:bCs w:val="0"/>
+          <w:noProof w:val="0"/>
+          <w:sz w:val="24"/>
+          <w:szCs w:val="24"/>
+          <w:lang w:val="en-US"/>
+        </w:rPr>
+        <w:t>. You can use your own device or access the university machines remotely.</w:t>
       </w:r>
     </w:p>
     <w:p xmlns:wp14="http://schemas.microsoft.com/office/word/2010/wordml" wp14:paraId="0E495DF4" wp14:textId="134EC7A9">
@@ -3751,13 +3622,15 @@
         </w:rPr>
         <w:t xml:space="preserve"> clone </w:t>
       </w:r>
-      <w:hyperlink r:id="R0c2ab1e2d0c54342">
+      <w:hyperlink r:id="Rb45792877d7f4446">
         <w:r>
           <w:rPr>
             <w:rStyle w:val="Hyperlink"/>
             <w:rFonts w:ascii="Consolas" w:hAnsi="Consolas" w:eastAsia="Consolas" w:cs="Consolas"/>
             <w:noProof w:val="0"/>
             <w:color w:val="auto"/>
+            <w:sz w:val="22"/>
+            <w:szCs w:val="22"/>
             <w:lang w:val="en-US"/>
           </w:rPr>
           <w:t>https://github.com/YOUR-USERNAME/southsea_cinema.git</w:t>
@@ -5949,7 +5822,7 @@
         </w:rPr>
         <w:t xml:space="preserve"> an </w:t>
       </w:r>
-      <w:hyperlink r:id="R267f0f7b0ed547d4">
+      <w:hyperlink r:id="R45154d42bdd64275">
         <w:r>
           <w:rPr>
             <w:rStyle w:val="Hyperlink"/>
@@ -6361,6 +6234,24 @@
         <w:pStyle w:val="Normal"/>
       </w:pPr>
     </w:p>
+    <w:p>
+      <w:r>
+        <w:rPr/>
+        <w:t xml:space="preserve">Follow the </w:t>
+      </w:r>
+      <w:hyperlink w:anchor="set-up-your-development-environment" r:id="Re2d5f8a400ba4973">
+        <w:r>
+          <w:rPr>
+            <w:rStyle w:val="Hyperlink"/>
+          </w:rPr>
+          <w:t>development environment instructions in Worksheet 1</w:t>
+        </w:r>
+      </w:hyperlink>
+      <w:r>
+        <w:rPr/>
+        <w:t>. You can use your own device or access the university machines remotely.</w:t>
+      </w:r>
+    </w:p>
     <w:sectPr>
       <w:pgSz w:w="11906" w:h="16838" w:orient="portrait"/>
       <w:pgMar w:top="1440" w:right="1440" w:bottom="1440" w:left="1440" w:header="720" w:footer="720" w:gutter="0"/>
@@ -6387,6 +6278,118 @@
 
 <file path=word/numbering.xml><?xml version="1.0" encoding="utf-8"?>
 <w:numbering xmlns:w="http://schemas.openxmlformats.org/wordprocessingml/2006/main">
+  <w:abstractNum xmlns:w="http://schemas.openxmlformats.org/wordprocessingml/2006/main" w:abstractNumId="6">
+    <w:nsid w:val="450d09d9"/>
+    <w:multiLevelType xmlns:w="http://schemas.openxmlformats.org/wordprocessingml/2006/main" w:val="hybridMultilevel"/>
+    <w:lvl xmlns:w="http://schemas.openxmlformats.org/wordprocessingml/2006/main" w:ilvl="0">
+      <w:start w:val="1"/>
+      <w:numFmt w:val="bullet"/>
+      <w:lvlText w:val=""/>
+      <w:lvlJc w:val="left"/>
+      <w:pPr>
+        <w:ind w:left="720" w:hanging="360"/>
+      </w:pPr>
+      <w:rPr>
+        <w:rFonts w:hint="default" w:ascii="Symbol" w:hAnsi="Symbol"/>
+      </w:rPr>
+    </w:lvl>
+    <w:lvl xmlns:w="http://schemas.openxmlformats.org/wordprocessingml/2006/main" w:ilvl="1">
+      <w:start w:val="1"/>
+      <w:numFmt w:val="bullet"/>
+      <w:lvlText w:val="o"/>
+      <w:lvlJc w:val="left"/>
+      <w:pPr>
+        <w:ind w:left="1440" w:hanging="360"/>
+      </w:pPr>
+      <w:rPr>
+        <w:rFonts w:hint="default" w:ascii="Courier New" w:hAnsi="Courier New"/>
+      </w:rPr>
+    </w:lvl>
+    <w:lvl xmlns:w="http://schemas.openxmlformats.org/wordprocessingml/2006/main" w:ilvl="2">
+      <w:start w:val="1"/>
+      <w:numFmt w:val="bullet"/>
+      <w:lvlText w:val=""/>
+      <w:lvlJc w:val="left"/>
+      <w:pPr>
+        <w:ind w:left="2160" w:hanging="360"/>
+      </w:pPr>
+      <w:rPr>
+        <w:rFonts w:hint="default" w:ascii="Wingdings" w:hAnsi="Wingdings"/>
+      </w:rPr>
+    </w:lvl>
+    <w:lvl xmlns:w="http://schemas.openxmlformats.org/wordprocessingml/2006/main" w:ilvl="3">
+      <w:start w:val="1"/>
+      <w:numFmt w:val="bullet"/>
+      <w:lvlText w:val=""/>
+      <w:lvlJc w:val="left"/>
+      <w:pPr>
+        <w:ind w:left="2880" w:hanging="360"/>
+      </w:pPr>
+      <w:rPr>
+        <w:rFonts w:hint="default" w:ascii="Symbol" w:hAnsi="Symbol"/>
+      </w:rPr>
+    </w:lvl>
+    <w:lvl xmlns:w="http://schemas.openxmlformats.org/wordprocessingml/2006/main" w:ilvl="4">
+      <w:start w:val="1"/>
+      <w:numFmt w:val="bullet"/>
+      <w:lvlText w:val="o"/>
+      <w:lvlJc w:val="left"/>
+      <w:pPr>
+        <w:ind w:left="3600" w:hanging="360"/>
+      </w:pPr>
+      <w:rPr>
+        <w:rFonts w:hint="default" w:ascii="Courier New" w:hAnsi="Courier New"/>
+      </w:rPr>
+    </w:lvl>
+    <w:lvl xmlns:w="http://schemas.openxmlformats.org/wordprocessingml/2006/main" w:ilvl="5">
+      <w:start w:val="1"/>
+      <w:numFmt w:val="bullet"/>
+      <w:lvlText w:val=""/>
+      <w:lvlJc w:val="left"/>
+      <w:pPr>
+        <w:ind w:left="4320" w:hanging="360"/>
+      </w:pPr>
+      <w:rPr>
+        <w:rFonts w:hint="default" w:ascii="Wingdings" w:hAnsi="Wingdings"/>
+      </w:rPr>
+    </w:lvl>
+    <w:lvl xmlns:w="http://schemas.openxmlformats.org/wordprocessingml/2006/main" w:ilvl="6">
+      <w:start w:val="1"/>
+      <w:numFmt w:val="bullet"/>
+      <w:lvlText w:val=""/>
+      <w:lvlJc w:val="left"/>
+      <w:pPr>
+        <w:ind w:left="5040" w:hanging="360"/>
+      </w:pPr>
+      <w:rPr>
+        <w:rFonts w:hint="default" w:ascii="Symbol" w:hAnsi="Symbol"/>
+      </w:rPr>
+    </w:lvl>
+    <w:lvl xmlns:w="http://schemas.openxmlformats.org/wordprocessingml/2006/main" w:ilvl="7">
+      <w:start w:val="1"/>
+      <w:numFmt w:val="bullet"/>
+      <w:lvlText w:val="o"/>
+      <w:lvlJc w:val="left"/>
+      <w:pPr>
+        <w:ind w:left="5760" w:hanging="360"/>
+      </w:pPr>
+      <w:rPr>
+        <w:rFonts w:hint="default" w:ascii="Courier New" w:hAnsi="Courier New"/>
+      </w:rPr>
+    </w:lvl>
+    <w:lvl xmlns:w="http://schemas.openxmlformats.org/wordprocessingml/2006/main" w:ilvl="8">
+      <w:start w:val="1"/>
+      <w:numFmt w:val="bullet"/>
+      <w:lvlText w:val=""/>
+      <w:lvlJc w:val="left"/>
+      <w:pPr>
+        <w:ind w:left="6480" w:hanging="360"/>
+      </w:pPr>
+      <w:rPr>
+        <w:rFonts w:hint="default" w:ascii="Wingdings" w:hAnsi="Wingdings"/>
+      </w:rPr>
+    </w:lvl>
+  </w:abstractNum>
   <w:abstractNum xmlns:w="http://schemas.openxmlformats.org/wordprocessingml/2006/main" w:abstractNumId="5">
     <w:nsid w:val="7e0e0502"/>
     <w:multiLevelType xmlns:w="http://schemas.openxmlformats.org/wordprocessingml/2006/main" w:val="hybridMultilevel"/>
@@ -6920,6 +6923,9 @@
       </w:rPr>
     </w:lvl>
   </w:abstractNum>
+  <w:num w:numId="6">
+    <w:abstractNumId w:val="6"/>
+  </w:num>
   <w:num w:numId="5">
     <w:abstractNumId w:val="5"/>
   </w:num>

</xml_diff>